<commit_message>
Curvas KM completas: global, estadio, sexo y edad
</commit_message>
<xml_diff>
--- a/documentación.docx
+++ b/documentación.docx
@@ -1827,6 +1827,292 @@
           <w:szCs w:val="22"/>
         </w:rPr>
         <w:t>. Dicho valor indica que las curvas de supervivencia difieren significativamente entre estadios, confirmando que el estadio TNM es un predictor robusto de supervivencia en este campo.</w:t>
+      </w:r>
+    </w:p>
+    <w:p>
+      <w:pPr>
+        <w:jc w:val="both"/>
+        <w:rPr>
+          <w:sz w:val="22"/>
+          <w:szCs w:val="22"/>
+        </w:rPr>
+      </w:pPr>
+      <w:r>
+        <w:rPr>
+          <w:rFonts w:ascii="Aptos" w:eastAsia="Times New Roman" w:hAnsi="Aptos" w:cs="Times New Roman"/>
+          <w:i/>
+          <w:iCs/>
+          <w:color w:val="0F4761" w:themeColor="accent1" w:themeShade="BF"/>
+          <w:sz w:val="22"/>
+          <w:szCs w:val="22"/>
+        </w:rPr>
+        <w:t>CURVA POR</w:t>
+      </w:r>
+      <w:r>
+        <w:rPr>
+          <w:rFonts w:ascii="Aptos" w:eastAsia="Times New Roman" w:hAnsi="Aptos" w:cs="Times New Roman"/>
+          <w:i/>
+          <w:iCs/>
+          <w:color w:val="0F4761" w:themeColor="accent1" w:themeShade="BF"/>
+          <w:sz w:val="22"/>
+          <w:szCs w:val="22"/>
+        </w:rPr>
+        <w:t xml:space="preserve"> SEXO BIOLÓGICO</w:t>
+      </w:r>
+    </w:p>
+    <w:p>
+      <w:pPr>
+        <w:jc w:val="both"/>
+        <w:rPr>
+          <w:sz w:val="22"/>
+          <w:szCs w:val="22"/>
+        </w:rPr>
+      </w:pPr>
+      <w:r>
+        <w:rPr>
+          <w:sz w:val="22"/>
+          <w:szCs w:val="22"/>
+        </w:rPr>
+        <w:drawing>
+          <wp:inline distT="0" distB="0" distL="0" distR="0" wp14:anchorId="423B55B1" wp14:editId="385A05C0">
+            <wp:extent cx="5400040" cy="3579495"/>
+            <wp:effectExtent l="0" t="0" r="0" b="1905"/>
+            <wp:docPr id="1528245333" name="Imagen 1"/>
+            <wp:cNvGraphicFramePr>
+              <a:graphicFrameLocks xmlns:a="http://schemas.openxmlformats.org/drawingml/2006/main" noChangeAspect="1"/>
+            </wp:cNvGraphicFramePr>
+            <a:graphic xmlns:a="http://schemas.openxmlformats.org/drawingml/2006/main">
+              <a:graphicData uri="http://schemas.openxmlformats.org/drawingml/2006/picture">
+                <pic:pic xmlns:pic="http://schemas.openxmlformats.org/drawingml/2006/picture">
+                  <pic:nvPicPr>
+                    <pic:cNvPr id="1528245333" name=""/>
+                    <pic:cNvPicPr/>
+                  </pic:nvPicPr>
+                  <pic:blipFill>
+                    <a:blip r:embed="rId10"/>
+                    <a:stretch>
+                      <a:fillRect/>
+                    </a:stretch>
+                  </pic:blipFill>
+                  <pic:spPr>
+                    <a:xfrm>
+                      <a:off x="0" y="0"/>
+                      <a:ext cx="5400040" cy="3579495"/>
+                    </a:xfrm>
+                    <a:prstGeom prst="rect">
+                      <a:avLst/>
+                    </a:prstGeom>
+                  </pic:spPr>
+                </pic:pic>
+              </a:graphicData>
+            </a:graphic>
+          </wp:inline>
+        </w:drawing>
+      </w:r>
+    </w:p>
+    <w:p>
+      <w:pPr>
+        <w:jc w:val="both"/>
+        <w:rPr>
+          <w:sz w:val="22"/>
+          <w:szCs w:val="22"/>
+        </w:rPr>
+      </w:pPr>
+      <w:r>
+        <w:rPr>
+          <w:sz w:val="22"/>
+          <w:szCs w:val="22"/>
+        </w:rPr>
+        <w:t>Esta curva nos muestra una ligera variación en el tiempo de supervivencia entre hombres y mujeres. En primer lugar, hasta los tres años las mujeres tienen una probabilidad de supervivencia ligeramente mayor que los hombres. A partir de entonces, por el contrario, su probabilidad desciende, posicionándose a lo largo de el resto del tiempo unas décimas por debajo de la de los hombre. De hecho, el registro de supervivencia para la mujer termina en los 18 años, mientras que para los hombres se alarga hasta los 20. Concretamente, entre los 13 y los 18 años, para la mujer la probabilidad sí que resulta realmente baja, con un 10%, frente al 30% (algo menos) del hombre.</w:t>
+      </w:r>
+    </w:p>
+    <w:p>
+      <w:pPr>
+        <w:jc w:val="both"/>
+        <w:rPr>
+          <w:sz w:val="22"/>
+          <w:szCs w:val="22"/>
+        </w:rPr>
+      </w:pPr>
+      <w:r>
+        <w:rPr>
+          <w:sz w:val="22"/>
+          <w:szCs w:val="22"/>
+        </w:rPr>
+        <w:t>No</w:t>
+      </w:r>
+      <w:r>
+        <w:rPr>
+          <w:sz w:val="22"/>
+          <w:szCs w:val="22"/>
+        </w:rPr>
+        <w:t xml:space="preserve"> obstante, en general, las diferencias en supervivencia por sexo observadas no son significativas. Precisamente, esto lo confirma el valor p del test Log-rank, que es 0.68.</w:t>
+      </w:r>
+    </w:p>
+    <w:p>
+      <w:pPr>
+        <w:jc w:val="both"/>
+        <w:rPr>
+          <w:sz w:val="22"/>
+          <w:szCs w:val="22"/>
+        </w:rPr>
+      </w:pPr>
+    </w:p>
+    <w:p>
+      <w:pPr>
+        <w:jc w:val="both"/>
+        <w:rPr>
+          <w:sz w:val="22"/>
+          <w:szCs w:val="22"/>
+        </w:rPr>
+      </w:pPr>
+    </w:p>
+    <w:p>
+      <w:pPr>
+        <w:jc w:val="both"/>
+        <w:rPr>
+          <w:sz w:val="22"/>
+          <w:szCs w:val="22"/>
+        </w:rPr>
+      </w:pPr>
+    </w:p>
+    <w:p>
+      <w:pPr>
+        <w:jc w:val="both"/>
+        <w:rPr>
+          <w:sz w:val="22"/>
+          <w:szCs w:val="22"/>
+        </w:rPr>
+      </w:pPr>
+    </w:p>
+    <w:p>
+      <w:pPr>
+        <w:jc w:val="both"/>
+        <w:rPr>
+          <w:sz w:val="22"/>
+          <w:szCs w:val="22"/>
+        </w:rPr>
+      </w:pPr>
+    </w:p>
+    <w:p>
+      <w:pPr>
+        <w:jc w:val="both"/>
+        <w:rPr>
+          <w:sz w:val="22"/>
+          <w:szCs w:val="22"/>
+        </w:rPr>
+      </w:pPr>
+      <w:r>
+        <w:rPr>
+          <w:rFonts w:ascii="Aptos" w:eastAsia="Times New Roman" w:hAnsi="Aptos" w:cs="Times New Roman"/>
+          <w:i/>
+          <w:iCs/>
+          <w:color w:val="0F4761" w:themeColor="accent1" w:themeShade="BF"/>
+          <w:sz w:val="22"/>
+          <w:szCs w:val="22"/>
+        </w:rPr>
+        <w:lastRenderedPageBreak/>
+        <w:t>CURVA POR</w:t>
+      </w:r>
+      <w:r>
+        <w:rPr>
+          <w:rFonts w:ascii="Aptos" w:eastAsia="Times New Roman" w:hAnsi="Aptos" w:cs="Times New Roman"/>
+          <w:i/>
+          <w:iCs/>
+          <w:color w:val="0F4761" w:themeColor="accent1" w:themeShade="BF"/>
+          <w:sz w:val="22"/>
+          <w:szCs w:val="22"/>
+        </w:rPr>
+        <w:t xml:space="preserve"> GRUPO DE EDAD</w:t>
+      </w:r>
+    </w:p>
+    <w:p>
+      <w:pPr>
+        <w:jc w:val="both"/>
+        <w:rPr>
+          <w:sz w:val="22"/>
+          <w:szCs w:val="22"/>
+        </w:rPr>
+      </w:pPr>
+      <w:r>
+        <w:rPr>
+          <w:sz w:val="22"/>
+          <w:szCs w:val="22"/>
+        </w:rPr>
+        <w:drawing>
+          <wp:inline distT="0" distB="0" distL="0" distR="0" wp14:anchorId="62626999" wp14:editId="00A3397C">
+            <wp:extent cx="5400040" cy="3763645"/>
+            <wp:effectExtent l="0" t="0" r="0" b="8255"/>
+            <wp:docPr id="1583264285" name="Imagen 1"/>
+            <wp:cNvGraphicFramePr>
+              <a:graphicFrameLocks xmlns:a="http://schemas.openxmlformats.org/drawingml/2006/main" noChangeAspect="1"/>
+            </wp:cNvGraphicFramePr>
+            <a:graphic xmlns:a="http://schemas.openxmlformats.org/drawingml/2006/main">
+              <a:graphicData uri="http://schemas.openxmlformats.org/drawingml/2006/picture">
+                <pic:pic xmlns:pic="http://schemas.openxmlformats.org/drawingml/2006/picture">
+                  <pic:nvPicPr>
+                    <pic:cNvPr id="1583264285" name=""/>
+                    <pic:cNvPicPr/>
+                  </pic:nvPicPr>
+                  <pic:blipFill>
+                    <a:blip r:embed="rId11"/>
+                    <a:stretch>
+                      <a:fillRect/>
+                    </a:stretch>
+                  </pic:blipFill>
+                  <pic:spPr>
+                    <a:xfrm>
+                      <a:off x="0" y="0"/>
+                      <a:ext cx="5400040" cy="3763645"/>
+                    </a:xfrm>
+                    <a:prstGeom prst="rect">
+                      <a:avLst/>
+                    </a:prstGeom>
+                  </pic:spPr>
+                </pic:pic>
+              </a:graphicData>
+            </a:graphic>
+          </wp:inline>
+        </w:drawing>
+      </w:r>
+    </w:p>
+    <w:p>
+      <w:pPr>
+        <w:jc w:val="both"/>
+        <w:rPr>
+          <w:sz w:val="22"/>
+          <w:szCs w:val="22"/>
+        </w:rPr>
+      </w:pPr>
+      <w:r>
+        <w:rPr>
+          <w:sz w:val="22"/>
+          <w:szCs w:val="22"/>
+        </w:rPr>
+        <w:t xml:space="preserve">Según se muestra en este último gráfico, los dos grupos de edad más jóvenes tienen un mayor tiempo de supervivencia, mientras que los registros de los pacientes más mayores terminan a los 13 años desde el diagnóstico. De hecho, para el último grupo de edad, de mayores de 75, el máximo tiempo registrado es de menos de 9 años, y con una probabilidad de supervivencia menor al 20%. </w:t>
+      </w:r>
+    </w:p>
+    <w:p>
+      <w:pPr>
+        <w:jc w:val="both"/>
+        <w:rPr>
+          <w:sz w:val="22"/>
+          <w:szCs w:val="22"/>
+        </w:rPr>
+      </w:pPr>
+      <w:r>
+        <w:rPr>
+          <w:sz w:val="22"/>
+          <w:szCs w:val="22"/>
+        </w:rPr>
+        <w:t>El valor p del test Log-rank, en cambio, sale 0.18, lo que significa que las diferencias en supervivencia por grupo de edad no son tan significativas. Según lo comentado previamente, se puede observar alguna diferencia entre los g</w:t>
+      </w:r>
+      <w:r>
+        <w:rPr>
+          <w:sz w:val="22"/>
+          <w:szCs w:val="22"/>
+        </w:rPr>
+        <w:t>rupos en los dos extremos del rango de edad; sin embargo, no contamos con el fundamento necesario para sacar conclusiones firmes. Esto es posiblemente debido a factores de confusión, como el estadio TNM, que no entra en esta curva. Esto lo abordaré en el modelo de Cox.</w:t>
       </w:r>
     </w:p>
     <w:p>

</xml_diff>

<commit_message>
Modelo de Cox completo: univariante, multivariante, validación y forest plot
</commit_message>
<xml_diff>
--- a/documentación.docx
+++ b/documentación.docx
@@ -90,7 +90,7 @@
                     <pic:cNvPicPr/>
                   </pic:nvPicPr>
                   <pic:blipFill>
-                    <a:blip r:embed="rId5"/>
+                    <a:blip r:embed="rId6"/>
                     <a:stretch>
                       <a:fillRect/>
                     </a:stretch>
@@ -803,7 +803,7 @@
                     <pic:cNvPicPr/>
                   </pic:nvPicPr>
                   <pic:blipFill>
-                    <a:blip r:embed="rId6"/>
+                    <a:blip r:embed="rId7"/>
                     <a:stretch>
                       <a:fillRect/>
                     </a:stretch>
@@ -911,7 +911,7 @@
                     <pic:cNvPicPr/>
                   </pic:nvPicPr>
                   <pic:blipFill>
-                    <a:blip r:embed="rId7">
+                    <a:blip r:embed="rId8">
                       <a:extLst>
                         <a:ext uri="{28A0092B-C50C-407E-A947-70E740481C1C}">
                           <a14:useLocalDpi xmlns:a14="http://schemas.microsoft.com/office/drawing/2010/main" val="0"/>
@@ -1679,7 +1679,7 @@
                     <pic:cNvPicPr/>
                   </pic:nvPicPr>
                   <pic:blipFill>
-                    <a:blip r:embed="rId8"/>
+                    <a:blip r:embed="rId9"/>
                     <a:stretch>
                       <a:fillRect/>
                     </a:stretch>
@@ -1769,7 +1769,7 @@
                     <pic:cNvPicPr/>
                   </pic:nvPicPr>
                   <pic:blipFill>
-                    <a:blip r:embed="rId9"/>
+                    <a:blip r:embed="rId10"/>
                     <a:stretch>
                       <a:fillRect/>
                     </a:stretch>
@@ -1889,7 +1889,7 @@
                     <pic:cNvPicPr/>
                   </pic:nvPicPr>
                   <pic:blipFill>
-                    <a:blip r:embed="rId10"/>
+                    <a:blip r:embed="rId11"/>
                     <a:stretch>
                       <a:fillRect/>
                     </a:stretch>
@@ -2055,7 +2055,7 @@
                     <pic:cNvPicPr/>
                   </pic:nvPicPr>
                   <pic:blipFill>
-                    <a:blip r:embed="rId11"/>
+                    <a:blip r:embed="rId12"/>
                     <a:stretch>
                       <a:fillRect/>
                     </a:stretch>
@@ -2122,8 +2122,441 @@
           <w:sz w:val="22"/>
           <w:szCs w:val="22"/>
         </w:rPr>
-      </w:pPr>
-    </w:p>
+        <w:sectPr>
+          <w:pgSz w:w="11906" w:h="16838"/>
+          <w:pgMar w:top="1417" w:right="1701" w:bottom="1417" w:left="1701" w:header="708" w:footer="708" w:gutter="0"/>
+          <w:cols w:space="708"/>
+          <w:docGrid w:linePitch="360"/>
+        </w:sectPr>
+      </w:pPr>
+    </w:p>
+    <w:p>
+      <w:pPr>
+        <w:pStyle w:val="Ttulo1"/>
+        <w:numPr>
+          <w:ilvl w:val="0"/>
+          <w:numId w:val="5"/>
+        </w:numPr>
+        <w:jc w:val="center"/>
+      </w:pPr>
+      <w:r>
+        <w:lastRenderedPageBreak/>
+        <w:t>Modelo de Cox</w:t>
+      </w:r>
+    </w:p>
+    <w:p>
+      <w:pPr>
+        <w:pStyle w:val="Ttulo1"/>
+      </w:pPr>
+      <w:r>
+        <w:rPr>
+          <w:rFonts w:ascii="Aptos" w:hAnsi="Aptos"/>
+          <w:i/>
+          <w:iCs/>
+          <w:sz w:val="22"/>
+          <w:szCs w:val="22"/>
+        </w:rPr>
+        <w:t xml:space="preserve">¿QUÉ ES </w:t>
+      </w:r>
+      <w:r>
+        <w:rPr>
+          <w:rFonts w:ascii="Aptos" w:hAnsi="Aptos"/>
+          <w:i/>
+          <w:iCs/>
+          <w:sz w:val="22"/>
+          <w:szCs w:val="22"/>
+        </w:rPr>
+        <w:t>UN MODELO DE COX</w:t>
+      </w:r>
+      <w:r>
+        <w:rPr>
+          <w:rFonts w:ascii="Aptos" w:hAnsi="Aptos"/>
+          <w:i/>
+          <w:iCs/>
+          <w:sz w:val="22"/>
+          <w:szCs w:val="22"/>
+        </w:rPr>
+        <w:t>?</w:t>
+      </w:r>
+    </w:p>
+    <w:p>
+      <w:pPr>
+        <w:jc w:val="both"/>
+        <w:rPr>
+          <w:sz w:val="22"/>
+          <w:szCs w:val="22"/>
+        </w:rPr>
+      </w:pPr>
+      <w:r>
+        <w:rPr>
+          <w:sz w:val="22"/>
+          <w:szCs w:val="22"/>
+        </w:rPr>
+        <w:t>El modelo de Cox es un modelo estadístico de regresión para datos de supervivencia</w:t>
+      </w:r>
+      <w:r>
+        <w:rPr>
+          <w:sz w:val="22"/>
+          <w:szCs w:val="22"/>
+        </w:rPr>
+        <w:t xml:space="preserve">. Su función es estimar </w:t>
+      </w:r>
+      <w:r>
+        <w:rPr>
+          <w:sz w:val="22"/>
+          <w:szCs w:val="22"/>
+        </w:rPr>
+        <w:t>el efecto de varias variables sobre el riesgo de que ocurra un evento</w:t>
+      </w:r>
+      <w:r>
+        <w:rPr>
+          <w:sz w:val="22"/>
+          <w:szCs w:val="22"/>
+        </w:rPr>
+        <w:t xml:space="preserve">, como la muerte del paciente, controlando </w:t>
+      </w:r>
+      <w:r>
+        <w:rPr>
+          <w:sz w:val="22"/>
+          <w:szCs w:val="22"/>
+        </w:rPr>
+        <w:t>por el efecto de las demás simultáneamente.</w:t>
+      </w:r>
+    </w:p>
+    <w:p>
+      <w:pPr>
+        <w:jc w:val="both"/>
+        <w:rPr>
+          <w:sz w:val="22"/>
+          <w:szCs w:val="22"/>
+        </w:rPr>
+      </w:pPr>
+      <w:r>
+        <w:rPr>
+          <w:sz w:val="22"/>
+          <w:szCs w:val="22"/>
+        </w:rPr>
+        <w:t xml:space="preserve">Es importante señalar que lo que modela no es la probabilidad de sobrevivir, sino el “hazard”. Esto es, la tasa instantánea de morir en cada momento, sabiendo que el paciente sigue vivo. En otras palabras, es el riesgo de morir “ahora mismo”. </w:t>
+      </w:r>
+    </w:p>
+    <w:p>
+      <w:pPr>
+        <w:jc w:val="both"/>
+        <w:rPr>
+          <w:sz w:val="22"/>
+          <w:szCs w:val="22"/>
+        </w:rPr>
+      </w:pPr>
+      <w:r>
+        <w:rPr>
+          <w:rFonts w:ascii="Aptos" w:eastAsia="Times New Roman" w:hAnsi="Aptos" w:cs="Times New Roman"/>
+          <w:i/>
+          <w:iCs/>
+          <w:color w:val="0F4761" w:themeColor="accent1" w:themeShade="BF"/>
+          <w:sz w:val="22"/>
+          <w:szCs w:val="22"/>
+        </w:rPr>
+        <w:t>APLICACIÓN AL PROYECTO</w:t>
+      </w:r>
+    </w:p>
+    <w:p>
+      <w:pPr>
+        <w:jc w:val="both"/>
+        <w:rPr>
+          <w:sz w:val="22"/>
+          <w:szCs w:val="22"/>
+        </w:rPr>
+      </w:pPr>
+      <w:r>
+        <w:rPr>
+          <w:sz w:val="22"/>
+          <w:szCs w:val="22"/>
+        </w:rPr>
+        <w:t xml:space="preserve">Si bien </w:t>
+      </w:r>
+      <w:r>
+        <w:rPr>
+          <w:sz w:val="22"/>
+          <w:szCs w:val="22"/>
+        </w:rPr>
+        <w:t xml:space="preserve">Kaplan-Meier compara grupos de forma descriptiva, </w:t>
+      </w:r>
+      <w:r>
+        <w:rPr>
+          <w:sz w:val="22"/>
+          <w:szCs w:val="22"/>
+        </w:rPr>
+        <w:t xml:space="preserve">no tiene la capacidad de controlar </w:t>
+      </w:r>
+      <w:r>
+        <w:rPr>
+          <w:sz w:val="22"/>
+          <w:szCs w:val="22"/>
+        </w:rPr>
+        <w:t xml:space="preserve">por varias variables a la vez. </w:t>
+      </w:r>
+      <w:r>
+        <w:rPr>
+          <w:sz w:val="22"/>
+          <w:szCs w:val="22"/>
+        </w:rPr>
+        <w:t xml:space="preserve">Es decir, que no podemos saber, por ejemplo, si el hecho de que las mujeres tengan mejor supervivencia, es por ser mujeres o porque los casos registrados para este sexo tienen estadios más tempranos. </w:t>
+      </w:r>
+      <w:r>
+        <w:rPr>
+          <w:sz w:val="22"/>
+          <w:szCs w:val="22"/>
+        </w:rPr>
+        <w:t xml:space="preserve">El modelo de Cox, en cambio, sí podría responder a esta pregunta, ya que analiza el efecto de cada variable manteniendo las demás constantes. </w:t>
+      </w:r>
+    </w:p>
+    <w:p>
+      <w:pPr>
+        <w:jc w:val="both"/>
+        <w:rPr>
+          <w:sz w:val="22"/>
+          <w:szCs w:val="22"/>
+        </w:rPr>
+      </w:pPr>
+      <w:r>
+        <w:rPr>
+          <w:sz w:val="22"/>
+          <w:szCs w:val="22"/>
+        </w:rPr>
+        <w:t>En esta sección, generaré dos modelos, un test de validación, y una visualización:</w:t>
+      </w:r>
+    </w:p>
+    <w:p>
+      <w:pPr>
+        <w:pStyle w:val="Prrafodelista"/>
+        <w:numPr>
+          <w:ilvl w:val="0"/>
+          <w:numId w:val="10"/>
+        </w:numPr>
+        <w:jc w:val="both"/>
+        <w:rPr>
+          <w:sz w:val="22"/>
+          <w:szCs w:val="22"/>
+        </w:rPr>
+      </w:pPr>
+      <w:r>
+        <w:rPr>
+          <w:b/>
+          <w:bCs/>
+          <w:sz w:val="22"/>
+          <w:szCs w:val="22"/>
+        </w:rPr>
+        <w:t>Modelo univariante:</w:t>
+      </w:r>
+      <w:r>
+        <w:rPr>
+          <w:sz w:val="22"/>
+          <w:szCs w:val="22"/>
+        </w:rPr>
+        <w:t xml:space="preserve"> modelo de Cox con una sola variable cada vez, para ver el efecto crudo de cada una</w:t>
+      </w:r>
+    </w:p>
+    <w:p>
+      <w:pPr>
+        <w:pStyle w:val="Prrafodelista"/>
+        <w:numPr>
+          <w:ilvl w:val="0"/>
+          <w:numId w:val="10"/>
+        </w:numPr>
+        <w:jc w:val="both"/>
+        <w:rPr>
+          <w:sz w:val="22"/>
+          <w:szCs w:val="22"/>
+        </w:rPr>
+      </w:pPr>
+      <w:r>
+        <w:rPr>
+          <w:b/>
+          <w:bCs/>
+          <w:sz w:val="22"/>
+          <w:szCs w:val="22"/>
+        </w:rPr>
+        <w:t>Modelo multivariante:</w:t>
+      </w:r>
+      <w:r>
+        <w:rPr>
+          <w:sz w:val="22"/>
+          <w:szCs w:val="22"/>
+        </w:rPr>
+        <w:t xml:space="preserve"> todas las variables juntas, para ver el efecto más ajustado</w:t>
+      </w:r>
+    </w:p>
+    <w:p>
+      <w:pPr>
+        <w:pStyle w:val="Prrafodelista"/>
+        <w:numPr>
+          <w:ilvl w:val="0"/>
+          <w:numId w:val="10"/>
+        </w:numPr>
+        <w:jc w:val="both"/>
+        <w:rPr>
+          <w:sz w:val="22"/>
+          <w:szCs w:val="22"/>
+        </w:rPr>
+      </w:pPr>
+      <w:r>
+        <w:rPr>
+          <w:b/>
+          <w:bCs/>
+          <w:sz w:val="22"/>
+          <w:szCs w:val="22"/>
+        </w:rPr>
+        <w:t>Validación de asunciones:</w:t>
+      </w:r>
+      <w:r>
+        <w:rPr>
+          <w:sz w:val="22"/>
+          <w:szCs w:val="22"/>
+        </w:rPr>
+        <w:t xml:space="preserve"> test de Schoenfeld para comprobar la proporcionalidad</w:t>
+      </w:r>
+    </w:p>
+    <w:p>
+      <w:pPr>
+        <w:pStyle w:val="Prrafodelista"/>
+        <w:numPr>
+          <w:ilvl w:val="0"/>
+          <w:numId w:val="10"/>
+        </w:numPr>
+        <w:jc w:val="both"/>
+        <w:rPr>
+          <w:sz w:val="22"/>
+          <w:szCs w:val="22"/>
+        </w:rPr>
+      </w:pPr>
+      <w:r>
+        <w:rPr>
+          <w:b/>
+          <w:bCs/>
+          <w:sz w:val="22"/>
+          <w:szCs w:val="22"/>
+        </w:rPr>
+        <w:t>Visualización:</w:t>
+      </w:r>
+      <w:r>
+        <w:rPr>
+          <w:sz w:val="22"/>
+          <w:szCs w:val="22"/>
+        </w:rPr>
+        <w:t xml:space="preserve"> visualización de los hazard ratios en un forest plot</w:t>
+      </w:r>
+    </w:p>
+    <w:p>
+      <w:pPr>
+        <w:jc w:val="both"/>
+        <w:rPr>
+          <w:rFonts w:ascii="Aptos" w:eastAsia="Times New Roman" w:hAnsi="Aptos" w:cs="Times New Roman"/>
+          <w:i/>
+          <w:iCs/>
+          <w:color w:val="0F4761" w:themeColor="accent1" w:themeShade="BF"/>
+          <w:sz w:val="22"/>
+          <w:szCs w:val="22"/>
+        </w:rPr>
+      </w:pPr>
+      <w:r>
+        <w:rPr>
+          <w:rFonts w:ascii="Aptos" w:eastAsia="Times New Roman" w:hAnsi="Aptos" w:cs="Times New Roman"/>
+          <w:i/>
+          <w:iCs/>
+          <w:color w:val="0F4761" w:themeColor="accent1" w:themeShade="BF"/>
+          <w:sz w:val="22"/>
+          <w:szCs w:val="22"/>
+        </w:rPr>
+        <w:t>MODELO UNIVARIANTE</w:t>
+      </w:r>
+    </w:p>
+    <w:p>
+      <w:pPr>
+        <w:jc w:val="both"/>
+        <w:rPr>
+          <w:rFonts w:ascii="Aptos" w:eastAsia="Times New Roman" w:hAnsi="Aptos" w:cs="Times New Roman"/>
+          <w:i/>
+          <w:iCs/>
+          <w:color w:val="0F4761" w:themeColor="accent1" w:themeShade="BF"/>
+          <w:sz w:val="22"/>
+          <w:szCs w:val="22"/>
+        </w:rPr>
+      </w:pPr>
+      <w:r>
+        <w:rPr>
+          <w:rFonts w:ascii="Aptos" w:eastAsia="Times New Roman" w:hAnsi="Aptos" w:cs="Times New Roman"/>
+          <w:i/>
+          <w:iCs/>
+          <w:color w:val="0F4761" w:themeColor="accent1" w:themeShade="BF"/>
+          <w:sz w:val="22"/>
+          <w:szCs w:val="22"/>
+        </w:rPr>
+        <w:t>MODELO MULTIVARIANTE</w:t>
+      </w:r>
+    </w:p>
+    <w:p>
+      <w:pPr>
+        <w:jc w:val="both"/>
+        <w:rPr>
+          <w:rFonts w:ascii="Aptos" w:eastAsia="Times New Roman" w:hAnsi="Aptos" w:cs="Times New Roman"/>
+          <w:i/>
+          <w:iCs/>
+          <w:color w:val="0F4761" w:themeColor="accent1" w:themeShade="BF"/>
+          <w:sz w:val="22"/>
+          <w:szCs w:val="22"/>
+        </w:rPr>
+      </w:pPr>
+      <w:r>
+        <w:rPr>
+          <w:rFonts w:ascii="Aptos" w:eastAsia="Times New Roman" w:hAnsi="Aptos" w:cs="Times New Roman"/>
+          <w:i/>
+          <w:iCs/>
+          <w:color w:val="0F4761" w:themeColor="accent1" w:themeShade="BF"/>
+          <w:sz w:val="22"/>
+          <w:szCs w:val="22"/>
+        </w:rPr>
+        <w:t>VALIDACIÓN DE ASUNCIONES</w:t>
+      </w:r>
+    </w:p>
+    <w:p>
+      <w:pPr>
+        <w:jc w:val="both"/>
+        <w:rPr>
+          <w:sz w:val="22"/>
+          <w:szCs w:val="22"/>
+        </w:rPr>
+      </w:pPr>
+      <w:r>
+        <w:rPr>
+          <w:rFonts w:ascii="Aptos" w:eastAsia="Times New Roman" w:hAnsi="Aptos" w:cs="Times New Roman"/>
+          <w:i/>
+          <w:iCs/>
+          <w:color w:val="0F4761" w:themeColor="accent1" w:themeShade="BF"/>
+          <w:sz w:val="22"/>
+          <w:szCs w:val="22"/>
+        </w:rPr>
+        <w:t>VISUALIZACIÓN</w:t>
+      </w:r>
+    </w:p>
+    <w:p>
+      <w:pPr>
+        <w:jc w:val="both"/>
+        <w:rPr>
+          <w:sz w:val="22"/>
+          <w:szCs w:val="22"/>
+        </w:rPr>
+      </w:pPr>
+    </w:p>
+    <w:p>
+      <w:pPr>
+        <w:jc w:val="both"/>
+        <w:rPr>
+          <w:sz w:val="22"/>
+          <w:szCs w:val="22"/>
+        </w:rPr>
+      </w:pPr>
+    </w:p>
+    <w:p/>
     <w:sectPr>
       <w:pgSz w:w="11906" w:h="16838"/>
       <w:pgMar w:top="1417" w:right="1701" w:bottom="1417" w:left="1701" w:header="708" w:footer="708" w:gutter="0"/>
@@ -2661,6 +3094,119 @@
     </w:lvl>
   </w:abstractNum>
   <w:abstractNum w:abstractNumId="4" w15:restartNumberingAfterBreak="0">
+    <w:nsid w:val="3B6845FC"/>
+    <w:multiLevelType w:val="hybridMultilevel"/>
+    <w:tmpl w:val="37842588"/>
+    <w:lvl w:ilvl="0" w:tplc="0C0A0001">
+      <w:start w:val="1"/>
+      <w:numFmt w:val="bullet"/>
+      <w:lvlText w:val=""/>
+      <w:lvlJc w:val="left"/>
+      <w:pPr>
+        <w:ind w:left="720" w:hanging="360"/>
+      </w:pPr>
+      <w:rPr>
+        <w:rFonts w:ascii="Symbol" w:hAnsi="Symbol" w:hint="default"/>
+      </w:rPr>
+    </w:lvl>
+    <w:lvl w:ilvl="1" w:tplc="0C0A0003" w:tentative="1">
+      <w:start w:val="1"/>
+      <w:numFmt w:val="bullet"/>
+      <w:lvlText w:val="o"/>
+      <w:lvlJc w:val="left"/>
+      <w:pPr>
+        <w:ind w:left="1440" w:hanging="360"/>
+      </w:pPr>
+      <w:rPr>
+        <w:rFonts w:ascii="Courier New" w:hAnsi="Courier New" w:cs="Courier New" w:hint="default"/>
+      </w:rPr>
+    </w:lvl>
+    <w:lvl w:ilvl="2" w:tplc="0C0A0005" w:tentative="1">
+      <w:start w:val="1"/>
+      <w:numFmt w:val="bullet"/>
+      <w:lvlText w:val=""/>
+      <w:lvlJc w:val="left"/>
+      <w:pPr>
+        <w:ind w:left="2160" w:hanging="360"/>
+      </w:pPr>
+      <w:rPr>
+        <w:rFonts w:ascii="Wingdings" w:hAnsi="Wingdings" w:hint="default"/>
+      </w:rPr>
+    </w:lvl>
+    <w:lvl w:ilvl="3" w:tplc="0C0A0001" w:tentative="1">
+      <w:start w:val="1"/>
+      <w:numFmt w:val="bullet"/>
+      <w:lvlText w:val=""/>
+      <w:lvlJc w:val="left"/>
+      <w:pPr>
+        <w:ind w:left="2880" w:hanging="360"/>
+      </w:pPr>
+      <w:rPr>
+        <w:rFonts w:ascii="Symbol" w:hAnsi="Symbol" w:hint="default"/>
+      </w:rPr>
+    </w:lvl>
+    <w:lvl w:ilvl="4" w:tplc="0C0A0003" w:tentative="1">
+      <w:start w:val="1"/>
+      <w:numFmt w:val="bullet"/>
+      <w:lvlText w:val="o"/>
+      <w:lvlJc w:val="left"/>
+      <w:pPr>
+        <w:ind w:left="3600" w:hanging="360"/>
+      </w:pPr>
+      <w:rPr>
+        <w:rFonts w:ascii="Courier New" w:hAnsi="Courier New" w:cs="Courier New" w:hint="default"/>
+      </w:rPr>
+    </w:lvl>
+    <w:lvl w:ilvl="5" w:tplc="0C0A0005" w:tentative="1">
+      <w:start w:val="1"/>
+      <w:numFmt w:val="bullet"/>
+      <w:lvlText w:val=""/>
+      <w:lvlJc w:val="left"/>
+      <w:pPr>
+        <w:ind w:left="4320" w:hanging="360"/>
+      </w:pPr>
+      <w:rPr>
+        <w:rFonts w:ascii="Wingdings" w:hAnsi="Wingdings" w:hint="default"/>
+      </w:rPr>
+    </w:lvl>
+    <w:lvl w:ilvl="6" w:tplc="0C0A0001" w:tentative="1">
+      <w:start w:val="1"/>
+      <w:numFmt w:val="bullet"/>
+      <w:lvlText w:val=""/>
+      <w:lvlJc w:val="left"/>
+      <w:pPr>
+        <w:ind w:left="5040" w:hanging="360"/>
+      </w:pPr>
+      <w:rPr>
+        <w:rFonts w:ascii="Symbol" w:hAnsi="Symbol" w:hint="default"/>
+      </w:rPr>
+    </w:lvl>
+    <w:lvl w:ilvl="7" w:tplc="0C0A0003" w:tentative="1">
+      <w:start w:val="1"/>
+      <w:numFmt w:val="bullet"/>
+      <w:lvlText w:val="o"/>
+      <w:lvlJc w:val="left"/>
+      <w:pPr>
+        <w:ind w:left="5760" w:hanging="360"/>
+      </w:pPr>
+      <w:rPr>
+        <w:rFonts w:ascii="Courier New" w:hAnsi="Courier New" w:cs="Courier New" w:hint="default"/>
+      </w:rPr>
+    </w:lvl>
+    <w:lvl w:ilvl="8" w:tplc="0C0A0005" w:tentative="1">
+      <w:start w:val="1"/>
+      <w:numFmt w:val="bullet"/>
+      <w:lvlText w:val=""/>
+      <w:lvlJc w:val="left"/>
+      <w:pPr>
+        <w:ind w:left="6480" w:hanging="360"/>
+      </w:pPr>
+      <w:rPr>
+        <w:rFonts w:ascii="Wingdings" w:hAnsi="Wingdings" w:hint="default"/>
+      </w:rPr>
+    </w:lvl>
+  </w:abstractNum>
+  <w:abstractNum w:abstractNumId="5" w15:restartNumberingAfterBreak="0">
     <w:nsid w:val="4D7E1F05"/>
     <w:multiLevelType w:val="hybridMultilevel"/>
     <w:tmpl w:val="BAD2A0AA"/>
@@ -2749,7 +3295,7 @@
       </w:pPr>
     </w:lvl>
   </w:abstractNum>
-  <w:abstractNum w:abstractNumId="5" w15:restartNumberingAfterBreak="0">
+  <w:abstractNum w:abstractNumId="6" w15:restartNumberingAfterBreak="0">
     <w:nsid w:val="5C8643E5"/>
     <w:multiLevelType w:val="multilevel"/>
     <w:tmpl w:val="3E161B4C"/>
@@ -2891,7 +3437,120 @@
       </w:rPr>
     </w:lvl>
   </w:abstractNum>
-  <w:abstractNum w:abstractNumId="6" w15:restartNumberingAfterBreak="0">
+  <w:abstractNum w:abstractNumId="7" w15:restartNumberingAfterBreak="0">
+    <w:nsid w:val="611955C4"/>
+    <w:multiLevelType w:val="multilevel"/>
+    <w:tmpl w:val="F1C6F8C8"/>
+    <w:lvl w:ilvl="0">
+      <w:start w:val="1"/>
+      <w:numFmt w:val="decimal"/>
+      <w:lvlText w:val="%1."/>
+      <w:lvlJc w:val="left"/>
+      <w:pPr>
+        <w:tabs>
+          <w:tab w:val="num" w:pos="720"/>
+        </w:tabs>
+        <w:ind w:left="720" w:hanging="360"/>
+      </w:pPr>
+    </w:lvl>
+    <w:lvl w:ilvl="1" w:tentative="1">
+      <w:start w:val="1"/>
+      <w:numFmt w:val="decimal"/>
+      <w:lvlText w:val="%2."/>
+      <w:lvlJc w:val="left"/>
+      <w:pPr>
+        <w:tabs>
+          <w:tab w:val="num" w:pos="1440"/>
+        </w:tabs>
+        <w:ind w:left="1440" w:hanging="360"/>
+      </w:pPr>
+    </w:lvl>
+    <w:lvl w:ilvl="2" w:tentative="1">
+      <w:start w:val="1"/>
+      <w:numFmt w:val="decimal"/>
+      <w:lvlText w:val="%3."/>
+      <w:lvlJc w:val="left"/>
+      <w:pPr>
+        <w:tabs>
+          <w:tab w:val="num" w:pos="2160"/>
+        </w:tabs>
+        <w:ind w:left="2160" w:hanging="360"/>
+      </w:pPr>
+    </w:lvl>
+    <w:lvl w:ilvl="3" w:tentative="1">
+      <w:start w:val="1"/>
+      <w:numFmt w:val="decimal"/>
+      <w:lvlText w:val="%4."/>
+      <w:lvlJc w:val="left"/>
+      <w:pPr>
+        <w:tabs>
+          <w:tab w:val="num" w:pos="2880"/>
+        </w:tabs>
+        <w:ind w:left="2880" w:hanging="360"/>
+      </w:pPr>
+    </w:lvl>
+    <w:lvl w:ilvl="4" w:tentative="1">
+      <w:start w:val="1"/>
+      <w:numFmt w:val="decimal"/>
+      <w:lvlText w:val="%5."/>
+      <w:lvlJc w:val="left"/>
+      <w:pPr>
+        <w:tabs>
+          <w:tab w:val="num" w:pos="3600"/>
+        </w:tabs>
+        <w:ind w:left="3600" w:hanging="360"/>
+      </w:pPr>
+    </w:lvl>
+    <w:lvl w:ilvl="5" w:tentative="1">
+      <w:start w:val="1"/>
+      <w:numFmt w:val="decimal"/>
+      <w:lvlText w:val="%6."/>
+      <w:lvlJc w:val="left"/>
+      <w:pPr>
+        <w:tabs>
+          <w:tab w:val="num" w:pos="4320"/>
+        </w:tabs>
+        <w:ind w:left="4320" w:hanging="360"/>
+      </w:pPr>
+    </w:lvl>
+    <w:lvl w:ilvl="6" w:tentative="1">
+      <w:start w:val="1"/>
+      <w:numFmt w:val="decimal"/>
+      <w:lvlText w:val="%7."/>
+      <w:lvlJc w:val="left"/>
+      <w:pPr>
+        <w:tabs>
+          <w:tab w:val="num" w:pos="5040"/>
+        </w:tabs>
+        <w:ind w:left="5040" w:hanging="360"/>
+      </w:pPr>
+    </w:lvl>
+    <w:lvl w:ilvl="7" w:tentative="1">
+      <w:start w:val="1"/>
+      <w:numFmt w:val="decimal"/>
+      <w:lvlText w:val="%8."/>
+      <w:lvlJc w:val="left"/>
+      <w:pPr>
+        <w:tabs>
+          <w:tab w:val="num" w:pos="5760"/>
+        </w:tabs>
+        <w:ind w:left="5760" w:hanging="360"/>
+      </w:pPr>
+    </w:lvl>
+    <w:lvl w:ilvl="8" w:tentative="1">
+      <w:start w:val="1"/>
+      <w:numFmt w:val="decimal"/>
+      <w:lvlText w:val="%9."/>
+      <w:lvlJc w:val="left"/>
+      <w:pPr>
+        <w:tabs>
+          <w:tab w:val="num" w:pos="6480"/>
+        </w:tabs>
+        <w:ind w:left="6480" w:hanging="360"/>
+      </w:pPr>
+    </w:lvl>
+  </w:abstractNum>
+  <w:abstractNum w:abstractNumId="8" w15:restartNumberingAfterBreak="0">
     <w:nsid w:val="61402468"/>
     <w:multiLevelType w:val="multilevel"/>
     <w:tmpl w:val="AB56B116"/>
@@ -3041,7 +3700,7 @@
     </w:lvl>
   </w:abstractNum>
   <w:num w:numId="1" w16cid:durableId="1157110251">
-    <w:abstractNumId w:val="5"/>
+    <w:abstractNumId w:val="6"/>
     <w:lvlOverride w:ilvl="0"/>
     <w:lvlOverride w:ilvl="1">
       <w:startOverride w:val="1"/>
@@ -3058,13 +3717,13 @@
     <w:abstractNumId w:val="0"/>
   </w:num>
   <w:num w:numId="3" w16cid:durableId="1912277694">
-    <w:abstractNumId w:val="6"/>
+    <w:abstractNumId w:val="8"/>
   </w:num>
   <w:num w:numId="4" w16cid:durableId="2126851761">
     <w:abstractNumId w:val="1"/>
   </w:num>
   <w:num w:numId="5" w16cid:durableId="1286275317">
-    <w:abstractNumId w:val="4"/>
+    <w:abstractNumId w:val="5"/>
   </w:num>
   <w:num w:numId="6" w16cid:durableId="1832598891">
     <w:abstractNumId w:val="1"/>
@@ -3074,6 +3733,12 @@
   </w:num>
   <w:num w:numId="8" w16cid:durableId="407457890">
     <w:abstractNumId w:val="2"/>
+  </w:num>
+  <w:num w:numId="9" w16cid:durableId="1471053413">
+    <w:abstractNumId w:val="7"/>
+  </w:num>
+  <w:num w:numId="10" w16cid:durableId="535385678">
+    <w:abstractNumId w:val="4"/>
   </w:num>
 </w:numbering>
 </file>
@@ -4294,4 +4959,16 @@
     </a:ext>
   </a:extLst>
 </a:theme>
+</file>
+
+<file path=customXml/item1.xml><?xml version="1.0" encoding="utf-8"?>
+<b:Sources xmlns:b="http://schemas.openxmlformats.org/officeDocument/2006/bibliography" xmlns="http://schemas.openxmlformats.org/officeDocument/2006/bibliography" SelectedStyle="\APASixthEditionOfficeOnline.xsl" StyleName="APA" Version="6"/>
+</file>
+
+<file path=customXml/itemProps1.xml><?xml version="1.0" encoding="utf-8"?>
+<ds:datastoreItem xmlns:ds="http://schemas.openxmlformats.org/officeDocument/2006/customXml" ds:itemID="{AC60CF52-07AE-4A6D-9F8C-ACFC04ACF3D6}">
+  <ds:schemaRefs>
+    <ds:schemaRef ds:uri="http://schemas.openxmlformats.org/officeDocument/2006/bibliography"/>
+  </ds:schemaRefs>
+</ds:datastoreItem>
 </file>
</xml_diff>

<commit_message>
Random Survival Forest completo: entrenamiento del modelo, comparativa de rendimiento, y variable importance por permutación
</commit_message>
<xml_diff>
--- a/documentación.docx
+++ b/documentación.docx
@@ -1846,18 +1846,7 @@
           <w:sz w:val="22"/>
           <w:szCs w:val="22"/>
         </w:rPr>
-        <w:t>CURVA POR</w:t>
-      </w:r>
-      <w:r>
-        <w:rPr>
-          <w:rFonts w:ascii="Aptos" w:eastAsia="Times New Roman" w:hAnsi="Aptos" w:cs="Times New Roman"/>
-          <w:i/>
-          <w:iCs/>
-          <w:color w:val="0F4761" w:themeColor="accent1" w:themeShade="BF"/>
-          <w:sz w:val="22"/>
-          <w:szCs w:val="22"/>
-        </w:rPr>
-        <w:t xml:space="preserve"> SEXO BIOLÓGICO</w:t>
+        <w:t>CURVA POR SEXO BIOLÓGICO</w:t>
       </w:r>
     </w:p>
     <w:p>
@@ -2012,18 +2001,7 @@
           <w:szCs w:val="22"/>
         </w:rPr>
         <w:lastRenderedPageBreak/>
-        <w:t>CURVA POR</w:t>
-      </w:r>
-      <w:r>
-        <w:rPr>
-          <w:rFonts w:ascii="Aptos" w:eastAsia="Times New Roman" w:hAnsi="Aptos" w:cs="Times New Roman"/>
-          <w:i/>
-          <w:iCs/>
-          <w:color w:val="0F4761" w:themeColor="accent1" w:themeShade="BF"/>
-          <w:sz w:val="22"/>
-          <w:szCs w:val="22"/>
-        </w:rPr>
-        <w:t xml:space="preserve"> GRUPO DE EDAD</w:t>
+        <w:t>CURVA POR GRUPO DE EDAD</w:t>
       </w:r>
     </w:p>
     <w:p>
@@ -2467,7 +2445,39 @@
           <w:sz w:val="22"/>
           <w:szCs w:val="22"/>
         </w:rPr>
-        <w:t>MODELO UNIVARIANTE</w:t>
+        <w:t>OBSERVACIONES PRELIMINARES</w:t>
+      </w:r>
+    </w:p>
+    <w:p>
+      <w:pPr>
+        <w:jc w:val="both"/>
+        <w:rPr>
+          <w:sz w:val="22"/>
+          <w:szCs w:val="22"/>
+        </w:rPr>
+      </w:pPr>
+      <w:r>
+        <w:rPr>
+          <w:sz w:val="22"/>
+          <w:szCs w:val="22"/>
+        </w:rPr>
+        <w:t xml:space="preserve">En la fase de preparación de variables para los modelos, ya se puede observar la distribución de N y M positivos. Es decir, los pacientes con los ganglios afectados en algún nivel N1, N2 o N3 y aquellos con metástasis en niveles M1, M1a y M1b, frente a los que no padecen alguna de las dos complicaciones de la enfermedad. </w:t>
+      </w:r>
+    </w:p>
+    <w:p>
+      <w:pPr>
+        <w:jc w:val="both"/>
+        <w:rPr>
+          <w:sz w:val="22"/>
+          <w:szCs w:val="22"/>
+        </w:rPr>
+      </w:pPr>
+      <w:r>
+        <w:rPr>
+          <w:sz w:val="22"/>
+          <w:szCs w:val="22"/>
+        </w:rPr>
+        <w:t xml:space="preserve">Concretamente, de los 509 pacientes analizados, son 383 los que incluyen registros de las categorías N y M. De estos, aproximadamente el 31% tienen los ganglios afectados, y entorno al 5% con metástasis. </w:t>
       </w:r>
     </w:p>
     <w:p>
@@ -2482,7 +2492,10 @@
           <w:szCs w:val="22"/>
         </w:rPr>
       </w:pPr>
-      <w:r>
+    </w:p>
+    <w:p>
+      <w:pPr>
+        <w:jc w:val="both"/>
         <w:rPr>
           <w:rFonts w:ascii="Aptos" w:eastAsia="Times New Roman" w:hAnsi="Aptos" w:cs="Times New Roman"/>
           <w:i/>
@@ -2491,8 +2504,7 @@
           <w:sz w:val="22"/>
           <w:szCs w:val="22"/>
         </w:rPr>
-        <w:t>MODELO MULTIVARIANTE</w:t>
-      </w:r>
+      </w:pPr>
     </w:p>
     <w:p>
       <w:pPr>
@@ -2506,7 +2518,10 @@
           <w:szCs w:val="22"/>
         </w:rPr>
       </w:pPr>
-      <w:r>
+    </w:p>
+    <w:p>
+      <w:pPr>
+        <w:jc w:val="both"/>
         <w:rPr>
           <w:rFonts w:ascii="Aptos" w:eastAsia="Times New Roman" w:hAnsi="Aptos" w:cs="Times New Roman"/>
           <w:i/>
@@ -2515,18 +2530,11 @@
           <w:sz w:val="22"/>
           <w:szCs w:val="22"/>
         </w:rPr>
-        <w:t>VALIDACIÓN DE ASUNCIONES</w:t>
-      </w:r>
-    </w:p>
-    <w:p>
-      <w:pPr>
-        <w:jc w:val="both"/>
-        <w:rPr>
-          <w:sz w:val="22"/>
-          <w:szCs w:val="22"/>
-        </w:rPr>
-      </w:pPr>
-      <w:r>
+      </w:pPr>
+    </w:p>
+    <w:p>
+      <w:pPr>
+        <w:jc w:val="both"/>
         <w:rPr>
           <w:rFonts w:ascii="Aptos" w:eastAsia="Times New Roman" w:hAnsi="Aptos" w:cs="Times New Roman"/>
           <w:i/>
@@ -2535,6 +2543,658 @@
           <w:sz w:val="22"/>
           <w:szCs w:val="22"/>
         </w:rPr>
+      </w:pPr>
+    </w:p>
+    <w:p>
+      <w:pPr>
+        <w:jc w:val="both"/>
+        <w:rPr>
+          <w:rFonts w:ascii="Aptos" w:eastAsia="Times New Roman" w:hAnsi="Aptos" w:cs="Times New Roman"/>
+          <w:i/>
+          <w:iCs/>
+          <w:color w:val="0F4761" w:themeColor="accent1" w:themeShade="BF"/>
+          <w:sz w:val="22"/>
+          <w:szCs w:val="22"/>
+        </w:rPr>
+      </w:pPr>
+      <w:r>
+        <w:rPr>
+          <w:rFonts w:ascii="Aptos" w:eastAsia="Times New Roman" w:hAnsi="Aptos" w:cs="Times New Roman"/>
+          <w:i/>
+          <w:iCs/>
+          <w:color w:val="0F4761" w:themeColor="accent1" w:themeShade="BF"/>
+          <w:sz w:val="22"/>
+          <w:szCs w:val="22"/>
+        </w:rPr>
+        <w:lastRenderedPageBreak/>
+        <w:t>MODELO UNIVARIANTE</w:t>
+      </w:r>
+    </w:p>
+    <w:p>
+      <w:pPr>
+        <w:jc w:val="center"/>
+        <w:rPr>
+          <w:sz w:val="22"/>
+          <w:szCs w:val="22"/>
+        </w:rPr>
+      </w:pPr>
+      <w:r>
+        <w:rPr>
+          <w:sz w:val="22"/>
+          <w:szCs w:val="22"/>
+        </w:rPr>
+        <w:drawing>
+          <wp:inline distT="0" distB="0" distL="0" distR="0" wp14:anchorId="4A93B263" wp14:editId="614F0DF4">
+            <wp:extent cx="3759825" cy="890954"/>
+            <wp:effectExtent l="0" t="0" r="0" b="4445"/>
+            <wp:docPr id="613484664" name="Imagen 1"/>
+            <wp:cNvGraphicFramePr>
+              <a:graphicFrameLocks xmlns:a="http://schemas.openxmlformats.org/drawingml/2006/main" noChangeAspect="1"/>
+            </wp:cNvGraphicFramePr>
+            <a:graphic xmlns:a="http://schemas.openxmlformats.org/drawingml/2006/main">
+              <a:graphicData uri="http://schemas.openxmlformats.org/drawingml/2006/picture">
+                <pic:pic xmlns:pic="http://schemas.openxmlformats.org/drawingml/2006/picture">
+                  <pic:nvPicPr>
+                    <pic:cNvPr id="613484664" name=""/>
+                    <pic:cNvPicPr/>
+                  </pic:nvPicPr>
+                  <pic:blipFill>
+                    <a:blip r:embed="rId13"/>
+                    <a:stretch>
+                      <a:fillRect/>
+                    </a:stretch>
+                  </pic:blipFill>
+                  <pic:spPr>
+                    <a:xfrm>
+                      <a:off x="0" y="0"/>
+                      <a:ext cx="3811555" cy="903212"/>
+                    </a:xfrm>
+                    <a:prstGeom prst="rect">
+                      <a:avLst/>
+                    </a:prstGeom>
+                  </pic:spPr>
+                </pic:pic>
+              </a:graphicData>
+            </a:graphic>
+          </wp:inline>
+        </w:drawing>
+      </w:r>
+    </w:p>
+    <w:p>
+      <w:pPr>
+        <w:jc w:val="both"/>
+        <w:rPr>
+          <w:sz w:val="22"/>
+          <w:szCs w:val="22"/>
+        </w:rPr>
+      </w:pPr>
+      <w:r>
+        <w:rPr>
+          <w:sz w:val="22"/>
+          <w:szCs w:val="22"/>
+        </w:rPr>
+        <w:t xml:space="preserve">Este modelo nos proporciona varios resultados interesantes. En primer lugar, en cuanto al estadio TNM se refiere, por cada nivel que este sube, el riesgo de fallecer aumenta un 66%, una estadística realmente significativa e impactante. Asimismo, las filas correspondientes a los ganglios y la metástasis, es decir, N y M positivos, también nos dan valores bajos de p. Por tanto, tener uno de los dos aumenta el riesgo de morir; concretamente, tener ganglios afectados lo dobla, y tener metástasis casi lo triplica. Si bien solo hay 20 pacientes con M+, ambos datos son reveladores. </w:t>
+      </w:r>
+    </w:p>
+    <w:p>
+      <w:pPr>
+        <w:jc w:val="both"/>
+        <w:rPr>
+          <w:sz w:val="22"/>
+          <w:szCs w:val="22"/>
+        </w:rPr>
+      </w:pPr>
+      <w:r>
+        <w:rPr>
+          <w:sz w:val="22"/>
+          <w:szCs w:val="22"/>
+        </w:rPr>
+        <w:t xml:space="preserve">La edad y el sexo, por el contrario, nos dan valores de p mayores, confirmando la falta de peso que demostraron las dos variables en las curvas de Kaplan-Meier. De hecho, por cada año adicional de edad, el riesgo solo aumenta un 0.6%, y aunque los hombres muestran un porcentaje mayor de riesgo que las mujeres (un 14%), tampoco es significativo. </w:t>
+      </w:r>
+    </w:p>
+    <w:p>
+      <w:pPr>
+        <w:jc w:val="both"/>
+        <w:rPr>
+          <w:sz w:val="22"/>
+          <w:szCs w:val="22"/>
+        </w:rPr>
+      </w:pPr>
+      <w:r>
+        <w:rPr>
+          <w:sz w:val="22"/>
+          <w:szCs w:val="22"/>
+        </w:rPr>
+        <w:t xml:space="preserve">Por consiguiente, las variables más relevantes en esta sección serán </w:t>
+      </w:r>
+      <w:r>
+        <w:rPr>
+          <w:sz w:val="22"/>
+          <w:szCs w:val="22"/>
+        </w:rPr>
+        <w:t>el estadio, y las variables binarias que indican si los ganglios están afectados y/o se ha dado la metástasis. Por otro lado, la edad y el sexo no resultan representativas en el análisis univariante. A continuación, en el modelo multivariante veremos qué sucede cuando todas las variables actúan juntas.</w:t>
+      </w:r>
+    </w:p>
+    <w:p>
+      <w:pPr>
+        <w:jc w:val="both"/>
+        <w:rPr>
+          <w:rFonts w:ascii="Aptos" w:eastAsia="Times New Roman" w:hAnsi="Aptos" w:cs="Times New Roman"/>
+          <w:i/>
+          <w:iCs/>
+          <w:color w:val="0F4761" w:themeColor="accent1" w:themeShade="BF"/>
+          <w:sz w:val="22"/>
+          <w:szCs w:val="22"/>
+        </w:rPr>
+      </w:pPr>
+      <w:r>
+        <w:rPr>
+          <w:rFonts w:ascii="Aptos" w:eastAsia="Times New Roman" w:hAnsi="Aptos" w:cs="Times New Roman"/>
+          <w:i/>
+          <w:iCs/>
+          <w:color w:val="0F4761" w:themeColor="accent1" w:themeShade="BF"/>
+          <w:sz w:val="22"/>
+          <w:szCs w:val="22"/>
+        </w:rPr>
+        <w:t>MODELO MULTIVARIANTE</w:t>
+      </w:r>
+    </w:p>
+    <w:p>
+      <w:pPr>
+        <w:jc w:val="both"/>
+        <w:rPr>
+          <w:sz w:val="22"/>
+          <w:szCs w:val="22"/>
+        </w:rPr>
+      </w:pPr>
+      <w:r>
+        <w:rPr>
+          <w:sz w:val="22"/>
+          <w:szCs w:val="22"/>
+        </w:rPr>
+        <w:drawing>
+          <wp:inline distT="0" distB="0" distL="0" distR="0" wp14:anchorId="6091A137" wp14:editId="67151507">
+            <wp:extent cx="5400040" cy="1383323"/>
+            <wp:effectExtent l="0" t="0" r="0" b="7620"/>
+            <wp:docPr id="1626777254" name="Imagen 1"/>
+            <wp:cNvGraphicFramePr>
+              <a:graphicFrameLocks xmlns:a="http://schemas.openxmlformats.org/drawingml/2006/main" noChangeAspect="1"/>
+            </wp:cNvGraphicFramePr>
+            <a:graphic xmlns:a="http://schemas.openxmlformats.org/drawingml/2006/main">
+              <a:graphicData uri="http://schemas.openxmlformats.org/drawingml/2006/picture">
+                <pic:pic xmlns:pic="http://schemas.openxmlformats.org/drawingml/2006/picture">
+                  <pic:nvPicPr>
+                    <pic:cNvPr id="1626777254" name=""/>
+                    <pic:cNvPicPr/>
+                  </pic:nvPicPr>
+                  <pic:blipFill rotWithShape="1">
+                    <a:blip r:embed="rId14"/>
+                    <a:srcRect b="38945"/>
+                    <a:stretch>
+                      <a:fillRect/>
+                    </a:stretch>
+                  </pic:blipFill>
+                  <pic:spPr bwMode="auto">
+                    <a:xfrm>
+                      <a:off x="0" y="0"/>
+                      <a:ext cx="5400040" cy="1383323"/>
+                    </a:xfrm>
+                    <a:prstGeom prst="rect">
+                      <a:avLst/>
+                    </a:prstGeom>
+                    <a:ln>
+                      <a:noFill/>
+                    </a:ln>
+                    <a:extLst>
+                      <a:ext uri="{53640926-AAD7-44D8-BBD7-CCE9431645EC}">
+                        <a14:shadowObscured xmlns:a14="http://schemas.microsoft.com/office/drawing/2010/main"/>
+                      </a:ext>
+                    </a:extLst>
+                  </pic:spPr>
+                </pic:pic>
+              </a:graphicData>
+            </a:graphic>
+          </wp:inline>
+        </w:drawing>
+      </w:r>
+    </w:p>
+    <w:p>
+      <w:pPr>
+        <w:jc w:val="both"/>
+        <w:rPr>
+          <w:sz w:val="22"/>
+          <w:szCs w:val="22"/>
+        </w:rPr>
+      </w:pPr>
+      <w:r>
+        <w:rPr>
+          <w:sz w:val="22"/>
+          <w:szCs w:val="22"/>
+        </w:rPr>
+        <w:t xml:space="preserve">De este modelo </w:t>
+      </w:r>
+      <w:r>
+        <w:rPr>
+          <w:sz w:val="22"/>
+          <w:szCs w:val="22"/>
+        </w:rPr>
+        <w:t>sacamos dos variables clave. Por un lado, el estadio continua siendo significativo, incluso controlando por todo lo demás. Específicamente, cada nivel de estadio aumenta el riesgo de muerte un 63%. Por otro lado, la metástasis es el factor más potente del modelo. Precisamente, tenerla casi cuadruplica el riesgo, controlando por estadio, ganglios afectados, edad y sexo.</w:t>
+      </w:r>
+      <w:r>
+        <w:rPr>
+          <w:sz w:val="22"/>
+          <w:szCs w:val="22"/>
+        </w:rPr>
+        <w:t xml:space="preserve"> </w:t>
+      </w:r>
+    </w:p>
+    <w:p>
+      <w:pPr>
+        <w:jc w:val="both"/>
+        <w:rPr>
+          <w:sz w:val="22"/>
+          <w:szCs w:val="22"/>
+        </w:rPr>
+      </w:pPr>
+      <w:r>
+        <w:rPr>
+          <w:sz w:val="22"/>
+          <w:szCs w:val="22"/>
+        </w:rPr>
+        <w:t xml:space="preserve">No obstante, en este modelo la afección de los ganglios pierde significancia, destapando que en realidad estaba explicada por el estadio, que ya de por sí incluye información sobre esta variable. Por lo tanto, al controlar por estadio, N+ no añade información adicional. Del mismo modo, como era de esperar, la edad y el sexo siguen sin añadir significancia. </w:t>
+      </w:r>
+    </w:p>
+    <w:p>
+      <w:pPr>
+        <w:jc w:val="both"/>
+        <w:rPr>
+          <w:sz w:val="22"/>
+          <w:szCs w:val="22"/>
+        </w:rPr>
+      </w:pPr>
+    </w:p>
+    <w:p>
+      <w:pPr>
+        <w:jc w:val="both"/>
+        <w:rPr>
+          <w:sz w:val="22"/>
+          <w:szCs w:val="22"/>
+        </w:rPr>
+      </w:pPr>
+      <w:r>
+        <w:rPr>
+          <w:sz w:val="22"/>
+          <w:szCs w:val="22"/>
+        </w:rPr>
+        <w:lastRenderedPageBreak/>
+        <w:drawing>
+          <wp:anchor distT="0" distB="0" distL="114300" distR="114300" simplePos="0" relativeHeight="251659264" behindDoc="0" locked="0" layoutInCell="1" allowOverlap="1" wp14:anchorId="77BC5DC9" wp14:editId="6BFD5316">
+            <wp:simplePos x="0" y="0"/>
+            <wp:positionH relativeFrom="margin">
+              <wp:align>right</wp:align>
+            </wp:positionH>
+            <wp:positionV relativeFrom="paragraph">
+              <wp:posOffset>55880</wp:posOffset>
+            </wp:positionV>
+            <wp:extent cx="1817077" cy="782711"/>
+            <wp:effectExtent l="0" t="0" r="0" b="0"/>
+            <wp:wrapSquare wrapText="bothSides"/>
+            <wp:docPr id="272226152" name="Imagen 1"/>
+            <wp:cNvGraphicFramePr>
+              <a:graphicFrameLocks xmlns:a="http://schemas.openxmlformats.org/drawingml/2006/main" noChangeAspect="1"/>
+            </wp:cNvGraphicFramePr>
+            <a:graphic xmlns:a="http://schemas.openxmlformats.org/drawingml/2006/main">
+              <a:graphicData uri="http://schemas.openxmlformats.org/drawingml/2006/picture">
+                <pic:pic xmlns:pic="http://schemas.openxmlformats.org/drawingml/2006/picture">
+                  <pic:nvPicPr>
+                    <pic:cNvPr id="272226152" name=""/>
+                    <pic:cNvPicPr/>
+                  </pic:nvPicPr>
+                  <pic:blipFill rotWithShape="1">
+                    <a:blip r:embed="rId14">
+                      <a:extLst>
+                        <a:ext uri="{28A0092B-C50C-407E-A947-70E740481C1C}">
+                          <a14:useLocalDpi xmlns:a14="http://schemas.microsoft.com/office/drawing/2010/main" val="0"/>
+                        </a:ext>
+                      </a:extLst>
+                    </a:blip>
+                    <a:srcRect t="65454" r="66351"/>
+                    <a:stretch>
+                      <a:fillRect/>
+                    </a:stretch>
+                  </pic:blipFill>
+                  <pic:spPr bwMode="auto">
+                    <a:xfrm>
+                      <a:off x="0" y="0"/>
+                      <a:ext cx="1817077" cy="782711"/>
+                    </a:xfrm>
+                    <a:prstGeom prst="rect">
+                      <a:avLst/>
+                    </a:prstGeom>
+                    <a:ln>
+                      <a:noFill/>
+                    </a:ln>
+                    <a:extLst>
+                      <a:ext uri="{53640926-AAD7-44D8-BBD7-CCE9431645EC}">
+                        <a14:shadowObscured xmlns:a14="http://schemas.microsoft.com/office/drawing/2010/main"/>
+                      </a:ext>
+                    </a:extLst>
+                  </pic:spPr>
+                </pic:pic>
+              </a:graphicData>
+            </a:graphic>
+          </wp:anchor>
+        </w:drawing>
+      </w:r>
+      <w:r>
+        <w:rPr>
+          <w:sz w:val="22"/>
+          <w:szCs w:val="22"/>
+        </w:rPr>
+        <w:t>Finalmente, con respecto a la calidad del modelo, obtenemos una concordancia del 0.67, lo que indica que el modelo acierta el orden de riesgo entre dos pacientes aleatorios el 67% de las veces. Esto, para un conjunto de datos con pocas variables, resulta un valor razonable, teniendo en cuenta que 0.5 sería azar, y 1 perfecto. Hemos de quedarnos, sin embargo, con el hallazgo de la confusión de N+, que ha podido ser descubierta gracias a este análisis.</w:t>
+      </w:r>
+    </w:p>
+    <w:p>
+      <w:pPr>
+        <w:jc w:val="both"/>
+        <w:rPr>
+          <w:rFonts w:ascii="Aptos" w:eastAsia="Times New Roman" w:hAnsi="Aptos" w:cs="Times New Roman"/>
+          <w:i/>
+          <w:iCs/>
+          <w:color w:val="0F4761" w:themeColor="accent1" w:themeShade="BF"/>
+          <w:sz w:val="22"/>
+          <w:szCs w:val="22"/>
+        </w:rPr>
+      </w:pPr>
+      <w:r>
+        <w:rPr>
+          <w:rFonts w:ascii="Aptos" w:eastAsia="Times New Roman" w:hAnsi="Aptos" w:cs="Times New Roman"/>
+          <w:i/>
+          <w:iCs/>
+          <w:color w:val="0F4761" w:themeColor="accent1" w:themeShade="BF"/>
+          <w:sz w:val="22"/>
+          <w:szCs w:val="22"/>
+        </w:rPr>
+        <w:t>VALIDACIÓN DE ASUNCIONES</w:t>
+      </w:r>
+    </w:p>
+    <w:p>
+      <w:pPr>
+        <w:jc w:val="both"/>
+        <w:rPr>
+          <w:sz w:val="22"/>
+          <w:szCs w:val="22"/>
+        </w:rPr>
+      </w:pPr>
+      <w:r>
+        <w:rPr>
+          <w:sz w:val="22"/>
+          <w:szCs w:val="22"/>
+        </w:rPr>
+        <w:drawing>
+          <wp:inline distT="0" distB="0" distL="0" distR="0" wp14:anchorId="30C6CE12" wp14:editId="420ACC1B">
+            <wp:extent cx="1822939" cy="930360"/>
+            <wp:effectExtent l="0" t="0" r="6350" b="3175"/>
+            <wp:docPr id="677871361" name="Imagen 1"/>
+            <wp:cNvGraphicFramePr>
+              <a:graphicFrameLocks xmlns:a="http://schemas.openxmlformats.org/drawingml/2006/main" noChangeAspect="1"/>
+            </wp:cNvGraphicFramePr>
+            <a:graphic xmlns:a="http://schemas.openxmlformats.org/drawingml/2006/main">
+              <a:graphicData uri="http://schemas.openxmlformats.org/drawingml/2006/picture">
+                <pic:pic xmlns:pic="http://schemas.openxmlformats.org/drawingml/2006/picture">
+                  <pic:nvPicPr>
+                    <pic:cNvPr id="677871361" name=""/>
+                    <pic:cNvPicPr/>
+                  </pic:nvPicPr>
+                  <pic:blipFill>
+                    <a:blip r:embed="rId15"/>
+                    <a:stretch>
+                      <a:fillRect/>
+                    </a:stretch>
+                  </pic:blipFill>
+                  <pic:spPr>
+                    <a:xfrm>
+                      <a:off x="0" y="0"/>
+                      <a:ext cx="1824814" cy="931317"/>
+                    </a:xfrm>
+                    <a:prstGeom prst="rect">
+                      <a:avLst/>
+                    </a:prstGeom>
+                  </pic:spPr>
+                </pic:pic>
+              </a:graphicData>
+            </a:graphic>
+          </wp:inline>
+        </w:drawing>
+      </w:r>
+    </w:p>
+    <w:p>
+      <w:pPr>
+        <w:jc w:val="both"/>
+        <w:rPr>
+          <w:sz w:val="22"/>
+          <w:szCs w:val="22"/>
+        </w:rPr>
+      </w:pPr>
+      <w:r>
+        <w:rPr>
+          <w:sz w:val="22"/>
+          <w:szCs w:val="22"/>
+        </w:rPr>
+        <w:t xml:space="preserve">A continuación, efectuo la validación de la asunción de proporcionalidad de riesgos, mediante el test de Schoenfeld. Según este método, si p&gt;0.05 para una variable, entonces la asunción se cumple. </w:t>
+      </w:r>
+    </w:p>
+    <w:p>
+      <w:pPr>
+        <w:jc w:val="both"/>
+        <w:rPr>
+          <w:sz w:val="22"/>
+          <w:szCs w:val="22"/>
+        </w:rPr>
+      </w:pPr>
+      <w:r>
+        <w:rPr>
+          <w:sz w:val="22"/>
+          <w:szCs w:val="22"/>
+        </w:rPr>
+        <w:t xml:space="preserve">Como se muestra en la tabla, esta se cumple para todas las variables, excepto para el estadio (p=0.01). Esto viene a decir que el efecto de esta variable sobre el riesgo no es constante a lo largo del tiempo, sino que su “hazard ratio”  cambia según el momento del seguimiento en el que estemos. De hecho, en realidad no resultaría extraño, ya que sería de esperar que el estadio tuviese más efecto en los primeros años, y luego se atenuase con el tiempo. </w:t>
+      </w:r>
+    </w:p>
+    <w:p>
+      <w:pPr>
+        <w:jc w:val="both"/>
+        <w:rPr>
+          <w:b/>
+          <w:bCs/>
+          <w:sz w:val="22"/>
+          <w:szCs w:val="22"/>
+        </w:rPr>
+      </w:pPr>
+      <w:r>
+        <w:rPr>
+          <w:sz w:val="22"/>
+          <w:szCs w:val="22"/>
+        </w:rPr>
+        <w:t xml:space="preserve">Al hilo de esto, existen diversas soluciones. La más directa, y la que yo emplearé, será añadir esta variable como estratificada en lugar de covariable. De esta manera, el modelo estimará una línea de base de riesgo diferente para cada estadio, en lugar de asumir proporcionalidad. </w:t>
+      </w:r>
+    </w:p>
+    <w:p>
+      <w:pPr>
+        <w:jc w:val="both"/>
+        <w:rPr>
+          <w:sz w:val="22"/>
+          <w:szCs w:val="22"/>
+        </w:rPr>
+      </w:pPr>
+      <w:r>
+        <w:rPr>
+          <w:sz w:val="22"/>
+          <w:szCs w:val="22"/>
+        </w:rPr>
+        <w:drawing>
+          <wp:inline distT="0" distB="0" distL="0" distR="0" wp14:anchorId="7BD95FA6" wp14:editId="474ACBA5">
+            <wp:extent cx="5400040" cy="1027430"/>
+            <wp:effectExtent l="0" t="0" r="0" b="1270"/>
+            <wp:docPr id="85058654" name="Imagen 1"/>
+            <wp:cNvGraphicFramePr>
+              <a:graphicFrameLocks xmlns:a="http://schemas.openxmlformats.org/drawingml/2006/main" noChangeAspect="1"/>
+            </wp:cNvGraphicFramePr>
+            <a:graphic xmlns:a="http://schemas.openxmlformats.org/drawingml/2006/main">
+              <a:graphicData uri="http://schemas.openxmlformats.org/drawingml/2006/picture">
+                <pic:pic xmlns:pic="http://schemas.openxmlformats.org/drawingml/2006/picture">
+                  <pic:nvPicPr>
+                    <pic:cNvPr id="85058654" name=""/>
+                    <pic:cNvPicPr/>
+                  </pic:nvPicPr>
+                  <pic:blipFill>
+                    <a:blip r:embed="rId16"/>
+                    <a:stretch>
+                      <a:fillRect/>
+                    </a:stretch>
+                  </pic:blipFill>
+                  <pic:spPr>
+                    <a:xfrm>
+                      <a:off x="0" y="0"/>
+                      <a:ext cx="5400040" cy="1027430"/>
+                    </a:xfrm>
+                    <a:prstGeom prst="rect">
+                      <a:avLst/>
+                    </a:prstGeom>
+                  </pic:spPr>
+                </pic:pic>
+              </a:graphicData>
+            </a:graphic>
+          </wp:inline>
+        </w:drawing>
+      </w:r>
+    </w:p>
+    <w:p>
+      <w:pPr>
+        <w:jc w:val="both"/>
+        <w:rPr>
+          <w:sz w:val="22"/>
+          <w:szCs w:val="22"/>
+        </w:rPr>
+      </w:pPr>
+      <w:r>
+        <w:rPr>
+          <w:sz w:val="22"/>
+          <w:szCs w:val="22"/>
+        </w:rPr>
+        <w:t xml:space="preserve">Con esa corrección, obtenemos que la variable más significativa es la que indica el nivel de metástasis, con un p-valor menor que 0.005. De hecho, sigue aumentando su relevancia, ya que aquí se demuestra que tener metástasis casi quintuplica el riesgo de morir, controlando por estadio, edad, sexo y ganglios. </w:t>
+      </w:r>
+    </w:p>
+    <w:p>
+      <w:pPr>
+        <w:jc w:val="both"/>
+      </w:pPr>
+      <w:r>
+        <w:rPr>
+          <w:sz w:val="22"/>
+          <w:szCs w:val="22"/>
+        </w:rPr>
+        <w:drawing>
+          <wp:anchor distT="0" distB="0" distL="114300" distR="114300" simplePos="0" relativeHeight="251660288" behindDoc="0" locked="0" layoutInCell="1" allowOverlap="1" wp14:anchorId="717F4898" wp14:editId="01B35733">
+            <wp:simplePos x="0" y="0"/>
+            <wp:positionH relativeFrom="margin">
+              <wp:posOffset>3790315</wp:posOffset>
+            </wp:positionH>
+            <wp:positionV relativeFrom="paragraph">
+              <wp:posOffset>7620</wp:posOffset>
+            </wp:positionV>
+            <wp:extent cx="1605280" cy="642620"/>
+            <wp:effectExtent l="0" t="0" r="0" b="5080"/>
+            <wp:wrapSquare wrapText="bothSides"/>
+            <wp:docPr id="996394666" name="Imagen 1"/>
+            <wp:cNvGraphicFramePr>
+              <a:graphicFrameLocks xmlns:a="http://schemas.openxmlformats.org/drawingml/2006/main" noChangeAspect="1"/>
+            </wp:cNvGraphicFramePr>
+            <a:graphic xmlns:a="http://schemas.openxmlformats.org/drawingml/2006/main">
+              <a:graphicData uri="http://schemas.openxmlformats.org/drawingml/2006/picture">
+                <pic:pic xmlns:pic="http://schemas.openxmlformats.org/drawingml/2006/picture">
+                  <pic:nvPicPr>
+                    <pic:cNvPr id="996394666" name=""/>
+                    <pic:cNvPicPr/>
+                  </pic:nvPicPr>
+                  <pic:blipFill>
+                    <a:blip r:embed="rId17">
+                      <a:extLst>
+                        <a:ext uri="{28A0092B-C50C-407E-A947-70E740481C1C}">
+                          <a14:useLocalDpi xmlns:a14="http://schemas.microsoft.com/office/drawing/2010/main" val="0"/>
+                        </a:ext>
+                      </a:extLst>
+                    </a:blip>
+                    <a:stretch>
+                      <a:fillRect/>
+                    </a:stretch>
+                  </pic:blipFill>
+                  <pic:spPr>
+                    <a:xfrm>
+                      <a:off x="0" y="0"/>
+                      <a:ext cx="1605280" cy="642620"/>
+                    </a:xfrm>
+                    <a:prstGeom prst="rect">
+                      <a:avLst/>
+                    </a:prstGeom>
+                  </pic:spPr>
+                </pic:pic>
+              </a:graphicData>
+            </a:graphic>
+            <wp14:sizeRelH relativeFrom="margin">
+              <wp14:pctWidth>0</wp14:pctWidth>
+            </wp14:sizeRelH>
+          </wp:anchor>
+        </w:drawing>
+      </w:r>
+      <w:r>
+        <w:rPr>
+          <w:sz w:val="22"/>
+          <w:szCs w:val="22"/>
+        </w:rPr>
+        <w:t>En cuanto a la concordancia (0.59), es algo menor que en el modelo anterior, puesto que ahora el estadio es estrato y no covariable, con lo cual no contribuye directamente a la concordancia.</w:t>
+      </w:r>
+      <w:r>
+        <w:t xml:space="preserve"> </w:t>
+      </w:r>
+    </w:p>
+    <w:p>
+      <w:pPr>
+        <w:jc w:val="both"/>
+      </w:pPr>
+      <w:r>
+        <w:lastRenderedPageBreak/>
+        <w:t>Además, la nueva validación de asunciones da todos los p-valores por encima de 0.05, por lo que ahora sí se cumple para todas las variables.</w:t>
+      </w:r>
+    </w:p>
+    <w:p>
+      <w:pPr>
+        <w:jc w:val="both"/>
+        <w:rPr>
+          <w:sz w:val="22"/>
+          <w:szCs w:val="22"/>
+        </w:rPr>
+      </w:pPr>
+      <w:r>
+        <w:t>En conclusión, el hallazgo principal es claro: la metástasis es el predictor más potente de mortalidad en cáncer de pulmón, una vez controlado por estadio. Por ende, un paciente en estadio III sin metástasis tendría un pronóstico muy diferente a uno con M1.</w:t>
+      </w:r>
+    </w:p>
+    <w:p>
+      <w:pPr>
+        <w:jc w:val="both"/>
+        <w:rPr>
+          <w:sz w:val="22"/>
+          <w:szCs w:val="22"/>
+        </w:rPr>
+      </w:pPr>
+      <w:r>
+        <w:rPr>
+          <w:rFonts w:ascii="Aptos" w:eastAsia="Times New Roman" w:hAnsi="Aptos" w:cs="Times New Roman"/>
+          <w:i/>
+          <w:iCs/>
+          <w:color w:val="0F4761" w:themeColor="accent1" w:themeShade="BF"/>
+          <w:sz w:val="22"/>
+          <w:szCs w:val="22"/>
+        </w:rPr>
         <w:t>VISUALIZACIÓN</w:t>
       </w:r>
     </w:p>
@@ -2546,15 +3206,407 @@
           <w:szCs w:val="22"/>
         </w:rPr>
       </w:pPr>
-    </w:p>
-    <w:p>
-      <w:pPr>
-        <w:jc w:val="both"/>
-        <w:rPr>
-          <w:sz w:val="22"/>
-          <w:szCs w:val="22"/>
-        </w:rPr>
-      </w:pPr>
+      <w:r>
+        <w:rPr>
+          <w:sz w:val="22"/>
+          <w:szCs w:val="22"/>
+        </w:rPr>
+        <w:drawing>
+          <wp:inline distT="0" distB="0" distL="0" distR="0" wp14:anchorId="72185641" wp14:editId="5A14C430">
+            <wp:extent cx="5400040" cy="2973070"/>
+            <wp:effectExtent l="0" t="0" r="0" b="0"/>
+            <wp:docPr id="117768140" name="Imagen 1"/>
+            <wp:cNvGraphicFramePr>
+              <a:graphicFrameLocks xmlns:a="http://schemas.openxmlformats.org/drawingml/2006/main" noChangeAspect="1"/>
+            </wp:cNvGraphicFramePr>
+            <a:graphic xmlns:a="http://schemas.openxmlformats.org/drawingml/2006/main">
+              <a:graphicData uri="http://schemas.openxmlformats.org/drawingml/2006/picture">
+                <pic:pic xmlns:pic="http://schemas.openxmlformats.org/drawingml/2006/picture">
+                  <pic:nvPicPr>
+                    <pic:cNvPr id="117768140" name=""/>
+                    <pic:cNvPicPr/>
+                  </pic:nvPicPr>
+                  <pic:blipFill>
+                    <a:blip r:embed="rId18"/>
+                    <a:stretch>
+                      <a:fillRect/>
+                    </a:stretch>
+                  </pic:blipFill>
+                  <pic:spPr>
+                    <a:xfrm>
+                      <a:off x="0" y="0"/>
+                      <a:ext cx="5400040" cy="2973070"/>
+                    </a:xfrm>
+                    <a:prstGeom prst="rect">
+                      <a:avLst/>
+                    </a:prstGeom>
+                  </pic:spPr>
+                </pic:pic>
+              </a:graphicData>
+            </a:graphic>
+          </wp:inline>
+        </w:drawing>
+      </w:r>
+    </w:p>
+    <w:p>
+      <w:pPr>
+        <w:jc w:val="both"/>
+      </w:pPr>
+      <w:r>
+        <w:t xml:space="preserve">En el “Forest Plot”, cada fila es una variable, y el cuadrado es el Hazard-Ratio estimado. Respecto a las líneas, las horizontales son el intervalo de confianza al 95%, mientras que la vertical discontinua representa HR = 1 como referencia. Si el intervalo de confianza la cruza, la variable no es significativa. </w:t>
+      </w:r>
+    </w:p>
+    <w:p>
+      <w:pPr>
+        <w:jc w:val="both"/>
+      </w:pPr>
+      <w:r>
+        <w:t xml:space="preserve">De él podemos extraer dos ideas claras. Por un lado, en la variable referente a la metástasis, el cuadrado está muy a la derecha (HR ~ 5) y el intervalo no cruza la línea de referencia, por lo que es significativa, y con gran efecto. Por el otro, los intervalos de las otras tres variables cruzan la línea del 1, con lo cual, no son significativos. </w:t>
+      </w:r>
+    </w:p>
+    <w:p>
+      <w:pPr>
+        <w:sectPr>
+          <w:pgSz w:w="11906" w:h="16838"/>
+          <w:pgMar w:top="1417" w:right="1701" w:bottom="1417" w:left="1701" w:header="708" w:footer="708" w:gutter="0"/>
+          <w:cols w:space="708"/>
+          <w:docGrid w:linePitch="360"/>
+        </w:sectPr>
+      </w:pPr>
+    </w:p>
+    <w:p>
+      <w:pPr>
+        <w:pStyle w:val="Ttulo1"/>
+        <w:numPr>
+          <w:ilvl w:val="0"/>
+          <w:numId w:val="5"/>
+        </w:numPr>
+        <w:jc w:val="center"/>
+      </w:pPr>
+      <w:r>
+        <w:lastRenderedPageBreak/>
+        <w:t>RANDOM SURVIVAL FOREST</w:t>
+      </w:r>
+    </w:p>
+    <w:p>
+      <w:pPr>
+        <w:pStyle w:val="Ttulo1"/>
+      </w:pPr>
+      <w:r>
+        <w:rPr>
+          <w:rFonts w:ascii="Aptos" w:hAnsi="Aptos"/>
+          <w:i/>
+          <w:iCs/>
+          <w:sz w:val="22"/>
+          <w:szCs w:val="22"/>
+        </w:rPr>
+        <w:t>¿</w:t>
+      </w:r>
+      <w:r>
+        <w:rPr>
+          <w:rFonts w:ascii="Aptos" w:hAnsi="Aptos"/>
+          <w:i/>
+          <w:iCs/>
+          <w:sz w:val="22"/>
+          <w:szCs w:val="22"/>
+        </w:rPr>
+        <w:t>QUÉ ES UN RANDOM SURVIVAL FOREST</w:t>
+      </w:r>
+      <w:r>
+        <w:rPr>
+          <w:rFonts w:ascii="Aptos" w:hAnsi="Aptos"/>
+          <w:i/>
+          <w:iCs/>
+          <w:sz w:val="22"/>
+          <w:szCs w:val="22"/>
+        </w:rPr>
+        <w:t>?</w:t>
+      </w:r>
+    </w:p>
+    <w:p>
+      <w:pPr>
+        <w:jc w:val="both"/>
+        <w:rPr>
+          <w:sz w:val="22"/>
+          <w:szCs w:val="22"/>
+        </w:rPr>
+      </w:pPr>
+      <w:r>
+        <w:rPr>
+          <w:sz w:val="22"/>
+          <w:szCs w:val="22"/>
+        </w:rPr>
+        <w:t>Se trata de l</w:t>
+      </w:r>
+      <w:r>
+        <w:rPr>
+          <w:sz w:val="22"/>
+          <w:szCs w:val="22"/>
+        </w:rPr>
+        <w:t xml:space="preserve">a adaptación del algoritmo Random Forest clásico al análisis de supervivencia. </w:t>
+      </w:r>
+      <w:r>
+        <w:rPr>
+          <w:sz w:val="22"/>
+          <w:szCs w:val="22"/>
+        </w:rPr>
+        <w:t>Este, e</w:t>
+      </w:r>
+      <w:r>
+        <w:rPr>
+          <w:sz w:val="22"/>
+          <w:szCs w:val="22"/>
+        </w:rPr>
+        <w:t xml:space="preserve">n lugar de predecir un valor numérico o una clase, predice el riesgo de que ocurra un evento a lo largo del tiempo, manejando correctamente la censura. </w:t>
+      </w:r>
+      <w:r>
+        <w:rPr>
+          <w:sz w:val="22"/>
+          <w:szCs w:val="22"/>
+        </w:rPr>
+        <w:t>Al contrario del modelo</w:t>
+      </w:r>
+      <w:r>
+        <w:rPr>
+          <w:sz w:val="22"/>
+          <w:szCs w:val="22"/>
+        </w:rPr>
+        <w:t xml:space="preserve"> de Cox</w:t>
+      </w:r>
+      <w:r>
+        <w:rPr>
+          <w:sz w:val="22"/>
+          <w:szCs w:val="22"/>
+        </w:rPr>
+        <w:t xml:space="preserve">, tiene la ventaja de que </w:t>
+      </w:r>
+      <w:r>
+        <w:rPr>
+          <w:sz w:val="22"/>
+          <w:szCs w:val="22"/>
+        </w:rPr>
+        <w:t>no asume ninguna relación lineal entre las variables y el riesgo</w:t>
+      </w:r>
+      <w:r>
+        <w:rPr>
+          <w:sz w:val="22"/>
+          <w:szCs w:val="22"/>
+        </w:rPr>
+        <w:t xml:space="preserve">. Por ende, </w:t>
+      </w:r>
+      <w:r>
+        <w:rPr>
+          <w:sz w:val="22"/>
+          <w:szCs w:val="22"/>
+        </w:rPr>
+        <w:t>puede capturar interacciones complejas y efectos no lineales que Cox no detecta.</w:t>
+      </w:r>
+    </w:p>
+    <w:p>
+      <w:pPr>
+        <w:jc w:val="both"/>
+        <w:rPr>
+          <w:sz w:val="22"/>
+          <w:szCs w:val="22"/>
+        </w:rPr>
+      </w:pPr>
+      <w:r>
+        <w:rPr>
+          <w:rFonts w:ascii="Aptos" w:eastAsia="Times New Roman" w:hAnsi="Aptos" w:cs="Times New Roman"/>
+          <w:i/>
+          <w:iCs/>
+          <w:color w:val="0F4761" w:themeColor="accent1" w:themeShade="BF"/>
+          <w:sz w:val="22"/>
+          <w:szCs w:val="22"/>
+        </w:rPr>
+        <w:t>APLICACIÓN AL PROYECTO</w:t>
+      </w:r>
+    </w:p>
+    <w:p>
+      <w:pPr>
+        <w:pStyle w:val="Prrafodelista"/>
+        <w:numPr>
+          <w:ilvl w:val="0"/>
+          <w:numId w:val="16"/>
+        </w:numPr>
+        <w:jc w:val="both"/>
+        <w:rPr>
+          <w:b/>
+          <w:bCs/>
+        </w:rPr>
+      </w:pPr>
+      <w:r>
+        <w:rPr>
+          <w:b/>
+          <w:bCs/>
+          <w:sz w:val="22"/>
+          <w:szCs w:val="22"/>
+        </w:rPr>
+        <w:t xml:space="preserve">Comparativa de rendimiento: </w:t>
+      </w:r>
+      <w:r>
+        <w:rPr>
+          <w:sz w:val="22"/>
+          <w:szCs w:val="22"/>
+        </w:rPr>
+        <w:t>para medir si el RSF predice mejor que Cox, usando el índice C y la puntuación Brier. Si su índice C es mayor, esto querrá decir que el RSF captura señal adicional que Cox no ve</w:t>
+      </w:r>
+    </w:p>
+    <w:p>
+      <w:pPr>
+        <w:pStyle w:val="Prrafodelista"/>
+        <w:numPr>
+          <w:ilvl w:val="0"/>
+          <w:numId w:val="16"/>
+        </w:numPr>
+        <w:jc w:val="both"/>
+        <w:rPr>
+          <w:b/>
+          <w:bCs/>
+        </w:rPr>
+      </w:pPr>
+      <w:r>
+        <w:rPr>
+          <w:b/>
+          <w:bCs/>
+          <w:sz w:val="22"/>
+          <w:szCs w:val="22"/>
+        </w:rPr>
+        <w:t>Variable importance:</w:t>
+      </w:r>
+      <w:r>
+        <w:t xml:space="preserve"> este algoritmo proporciona automáticamente las variables más importantes para predecir la supervivencia, sin asumir linealidad. De ese modo, será una forma de validar los resultados de Cox desde otra perspectiva.</w:t>
+      </w:r>
+    </w:p>
+    <w:p>
+      <w:pPr>
+        <w:pStyle w:val="Prrafodelista"/>
+        <w:numPr>
+          <w:ilvl w:val="0"/>
+          <w:numId w:val="16"/>
+        </w:numPr>
+        <w:jc w:val="both"/>
+        <w:rPr>
+          <w:b/>
+          <w:bCs/>
+        </w:rPr>
+      </w:pPr>
+      <w:r>
+        <w:rPr>
+          <w:b/>
+          <w:bCs/>
+          <w:sz w:val="22"/>
+          <w:szCs w:val="22"/>
+        </w:rPr>
+        <w:t>Explicabilidad:</w:t>
+      </w:r>
+      <w:r>
+        <w:t xml:space="preserve"> en la siguiente sección, usaré SHAP sobre RSF para explicar la predicción de pacientes individuales.</w:t>
+      </w:r>
+    </w:p>
+    <w:p>
+      <w:pPr>
+        <w:pStyle w:val="Prrafodelista"/>
+        <w:jc w:val="both"/>
+        <w:rPr>
+          <w:b/>
+          <w:bCs/>
+        </w:rPr>
+      </w:pPr>
+    </w:p>
+    <w:p/>
+    <w:p/>
+    <w:p/>
+    <w:p/>
+    <w:p/>
+    <w:p>
+      <w:r>
+        <w:t>El modelo de Cox estratificado (C-index = 0.670) supera al RSF (C-index = 0.618) en este dataset, lo que sugiere que las relaciones entre las variables clínicas y la supervivencia son predominantemente lineales y que el tamaño muestral limita la ventaja de los métodos de ML.</w:t>
+      </w:r>
+    </w:p>
+    <w:p/>
+    <w:p/>
+    <w:p/>
+    <w:p/>
+    <w:p/>
+    <w:p>
+      <w:pPr>
+        <w:pStyle w:val="Ttulo1"/>
+      </w:pPr>
+      <w:r>
+        <w:lastRenderedPageBreak/>
+        <w:t>INTEGRAR DATOS ESPAÑOLES</w:t>
+      </w:r>
+    </w:p>
+    <w:p>
+      <w:r>
+        <w:rPr>
+          <w:b/>
+          <w:bCs/>
+        </w:rPr>
+        <w:t>Opción A — Contextualización epidemiológica (fácil, 1-2 días)</w:t>
+      </w:r>
+      <w:r>
+        <w:br/>
+        <w:t>No cambias el análisis principal, pero añades un notebook introductorio (00_contexto_españa.ipynb) que descarga datos del INE o del Ministerio de Sanidad sobre incidencia y mortalidad por cáncer de pulmón en España, y los visualiza. Así el proyecto arranca con contexto local antes de entrar en TCGA.</w:t>
+      </w:r>
+    </w:p>
+    <w:p>
+      <w:r>
+        <w:t>Los datos están disponibles en:</w:t>
+      </w:r>
+    </w:p>
+    <w:p>
+      <w:pPr>
+        <w:numPr>
+          <w:ilvl w:val="0"/>
+          <w:numId w:val="15"/>
+        </w:numPr>
+      </w:pPr>
+      <w:hyperlink r:id="rId19" w:history="1">
+        <w:r>
+          <w:rPr>
+            <w:rStyle w:val="Hipervnculo"/>
+          </w:rPr>
+          <w:t>INE — Estadística de defunciones</w:t>
+        </w:r>
+      </w:hyperlink>
+    </w:p>
+    <w:p>
+      <w:pPr>
+        <w:numPr>
+          <w:ilvl w:val="0"/>
+          <w:numId w:val="15"/>
+        </w:numPr>
+      </w:pPr>
+      <w:hyperlink r:id="rId20" w:history="1">
+        <w:r>
+          <w:rPr>
+            <w:rStyle w:val="Hipervnculo"/>
+          </w:rPr>
+          <w:t>Ministerio de Sanidad — ENSE</w:t>
+        </w:r>
+      </w:hyperlink>
+    </w:p>
+    <w:p>
+      <w:r>
+        <w:pict w14:anchorId="2C150BEB">
+          <v:rect id="_x0000_i1025" style="width:0;height:1.5pt" o:hralign="center" o:hrstd="t" o:hr="t" fillcolor="#a0a0a0" stroked="f"/>
+        </w:pict>
+      </w:r>
+    </w:p>
+    <w:p>
+      <w:r>
+        <w:rPr>
+          <w:b/>
+          <w:bCs/>
+        </w:rPr>
+        <w:t>Opción B — Comparativa TCGA vs población española (intermedio, 1 semana)</w:t>
+      </w:r>
+      <w:r>
+        <w:br/>
+        <w:t>Compares las tasas de supervivencia de TCGA-LUAD con las publicadas por el Registro Nacional de Tumores o el SEOM (Sociedad Española de Oncología Médica). Esto da un ángulo de "¿son los patrones de TCGA representativos de la realidad española?", que es una pregunta muy legítima para un concurso.</w:t>
+      </w:r>
     </w:p>
     <w:p/>
     <w:sectPr>
@@ -2981,6 +4033,304 @@
     </w:lvl>
   </w:abstractNum>
   <w:abstractNum w:abstractNumId="3" w15:restartNumberingAfterBreak="0">
+    <w:nsid w:val="1FD31FF4"/>
+    <w:multiLevelType w:val="multilevel"/>
+    <w:tmpl w:val="279AA01E"/>
+    <w:lvl w:ilvl="0">
+      <w:start w:val="1"/>
+      <w:numFmt w:val="bullet"/>
+      <w:lvlText w:val=""/>
+      <w:lvlJc w:val="left"/>
+      <w:pPr>
+        <w:tabs>
+          <w:tab w:val="num" w:pos="720"/>
+        </w:tabs>
+        <w:ind w:left="720" w:hanging="360"/>
+      </w:pPr>
+      <w:rPr>
+        <w:rFonts w:ascii="Symbol" w:hAnsi="Symbol" w:hint="default"/>
+        <w:sz w:val="20"/>
+      </w:rPr>
+    </w:lvl>
+    <w:lvl w:ilvl="1" w:tentative="1">
+      <w:start w:val="1"/>
+      <w:numFmt w:val="bullet"/>
+      <w:lvlText w:val="o"/>
+      <w:lvlJc w:val="left"/>
+      <w:pPr>
+        <w:tabs>
+          <w:tab w:val="num" w:pos="1440"/>
+        </w:tabs>
+        <w:ind w:left="1440" w:hanging="360"/>
+      </w:pPr>
+      <w:rPr>
+        <w:rFonts w:ascii="Courier New" w:hAnsi="Courier New" w:hint="default"/>
+        <w:sz w:val="20"/>
+      </w:rPr>
+    </w:lvl>
+    <w:lvl w:ilvl="2" w:tentative="1">
+      <w:start w:val="1"/>
+      <w:numFmt w:val="bullet"/>
+      <w:lvlText w:val=""/>
+      <w:lvlJc w:val="left"/>
+      <w:pPr>
+        <w:tabs>
+          <w:tab w:val="num" w:pos="2160"/>
+        </w:tabs>
+        <w:ind w:left="2160" w:hanging="360"/>
+      </w:pPr>
+      <w:rPr>
+        <w:rFonts w:ascii="Wingdings" w:hAnsi="Wingdings" w:hint="default"/>
+        <w:sz w:val="20"/>
+      </w:rPr>
+    </w:lvl>
+    <w:lvl w:ilvl="3" w:tentative="1">
+      <w:start w:val="1"/>
+      <w:numFmt w:val="bullet"/>
+      <w:lvlText w:val=""/>
+      <w:lvlJc w:val="left"/>
+      <w:pPr>
+        <w:tabs>
+          <w:tab w:val="num" w:pos="2880"/>
+        </w:tabs>
+        <w:ind w:left="2880" w:hanging="360"/>
+      </w:pPr>
+      <w:rPr>
+        <w:rFonts w:ascii="Wingdings" w:hAnsi="Wingdings" w:hint="default"/>
+        <w:sz w:val="20"/>
+      </w:rPr>
+    </w:lvl>
+    <w:lvl w:ilvl="4" w:tentative="1">
+      <w:start w:val="1"/>
+      <w:numFmt w:val="bullet"/>
+      <w:lvlText w:val=""/>
+      <w:lvlJc w:val="left"/>
+      <w:pPr>
+        <w:tabs>
+          <w:tab w:val="num" w:pos="3600"/>
+        </w:tabs>
+        <w:ind w:left="3600" w:hanging="360"/>
+      </w:pPr>
+      <w:rPr>
+        <w:rFonts w:ascii="Wingdings" w:hAnsi="Wingdings" w:hint="default"/>
+        <w:sz w:val="20"/>
+      </w:rPr>
+    </w:lvl>
+    <w:lvl w:ilvl="5" w:tentative="1">
+      <w:start w:val="1"/>
+      <w:numFmt w:val="bullet"/>
+      <w:lvlText w:val=""/>
+      <w:lvlJc w:val="left"/>
+      <w:pPr>
+        <w:tabs>
+          <w:tab w:val="num" w:pos="4320"/>
+        </w:tabs>
+        <w:ind w:left="4320" w:hanging="360"/>
+      </w:pPr>
+      <w:rPr>
+        <w:rFonts w:ascii="Wingdings" w:hAnsi="Wingdings" w:hint="default"/>
+        <w:sz w:val="20"/>
+      </w:rPr>
+    </w:lvl>
+    <w:lvl w:ilvl="6" w:tentative="1">
+      <w:start w:val="1"/>
+      <w:numFmt w:val="bullet"/>
+      <w:lvlText w:val=""/>
+      <w:lvlJc w:val="left"/>
+      <w:pPr>
+        <w:tabs>
+          <w:tab w:val="num" w:pos="5040"/>
+        </w:tabs>
+        <w:ind w:left="5040" w:hanging="360"/>
+      </w:pPr>
+      <w:rPr>
+        <w:rFonts w:ascii="Wingdings" w:hAnsi="Wingdings" w:hint="default"/>
+        <w:sz w:val="20"/>
+      </w:rPr>
+    </w:lvl>
+    <w:lvl w:ilvl="7" w:tentative="1">
+      <w:start w:val="1"/>
+      <w:numFmt w:val="bullet"/>
+      <w:lvlText w:val=""/>
+      <w:lvlJc w:val="left"/>
+      <w:pPr>
+        <w:tabs>
+          <w:tab w:val="num" w:pos="5760"/>
+        </w:tabs>
+        <w:ind w:left="5760" w:hanging="360"/>
+      </w:pPr>
+      <w:rPr>
+        <w:rFonts w:ascii="Wingdings" w:hAnsi="Wingdings" w:hint="default"/>
+        <w:sz w:val="20"/>
+      </w:rPr>
+    </w:lvl>
+    <w:lvl w:ilvl="8" w:tentative="1">
+      <w:start w:val="1"/>
+      <w:numFmt w:val="bullet"/>
+      <w:lvlText w:val=""/>
+      <w:lvlJc w:val="left"/>
+      <w:pPr>
+        <w:tabs>
+          <w:tab w:val="num" w:pos="6480"/>
+        </w:tabs>
+        <w:ind w:left="6480" w:hanging="360"/>
+      </w:pPr>
+      <w:rPr>
+        <w:rFonts w:ascii="Wingdings" w:hAnsi="Wingdings" w:hint="default"/>
+        <w:sz w:val="20"/>
+      </w:rPr>
+    </w:lvl>
+  </w:abstractNum>
+  <w:abstractNum w:abstractNumId="4" w15:restartNumberingAfterBreak="0">
+    <w:nsid w:val="21DF1DC1"/>
+    <w:multiLevelType w:val="multilevel"/>
+    <w:tmpl w:val="3CE6B2BC"/>
+    <w:lvl w:ilvl="0">
+      <w:start w:val="1"/>
+      <w:numFmt w:val="bullet"/>
+      <w:lvlText w:val=""/>
+      <w:lvlJc w:val="left"/>
+      <w:pPr>
+        <w:tabs>
+          <w:tab w:val="num" w:pos="720"/>
+        </w:tabs>
+        <w:ind w:left="720" w:hanging="360"/>
+      </w:pPr>
+      <w:rPr>
+        <w:rFonts w:ascii="Symbol" w:hAnsi="Symbol" w:hint="default"/>
+        <w:sz w:val="20"/>
+      </w:rPr>
+    </w:lvl>
+    <w:lvl w:ilvl="1" w:tentative="1">
+      <w:start w:val="1"/>
+      <w:numFmt w:val="bullet"/>
+      <w:lvlText w:val="o"/>
+      <w:lvlJc w:val="left"/>
+      <w:pPr>
+        <w:tabs>
+          <w:tab w:val="num" w:pos="1440"/>
+        </w:tabs>
+        <w:ind w:left="1440" w:hanging="360"/>
+      </w:pPr>
+      <w:rPr>
+        <w:rFonts w:ascii="Courier New" w:hAnsi="Courier New" w:hint="default"/>
+        <w:sz w:val="20"/>
+      </w:rPr>
+    </w:lvl>
+    <w:lvl w:ilvl="2" w:tentative="1">
+      <w:start w:val="1"/>
+      <w:numFmt w:val="bullet"/>
+      <w:lvlText w:val=""/>
+      <w:lvlJc w:val="left"/>
+      <w:pPr>
+        <w:tabs>
+          <w:tab w:val="num" w:pos="2160"/>
+        </w:tabs>
+        <w:ind w:left="2160" w:hanging="360"/>
+      </w:pPr>
+      <w:rPr>
+        <w:rFonts w:ascii="Wingdings" w:hAnsi="Wingdings" w:hint="default"/>
+        <w:sz w:val="20"/>
+      </w:rPr>
+    </w:lvl>
+    <w:lvl w:ilvl="3" w:tentative="1">
+      <w:start w:val="1"/>
+      <w:numFmt w:val="bullet"/>
+      <w:lvlText w:val=""/>
+      <w:lvlJc w:val="left"/>
+      <w:pPr>
+        <w:tabs>
+          <w:tab w:val="num" w:pos="2880"/>
+        </w:tabs>
+        <w:ind w:left="2880" w:hanging="360"/>
+      </w:pPr>
+      <w:rPr>
+        <w:rFonts w:ascii="Wingdings" w:hAnsi="Wingdings" w:hint="default"/>
+        <w:sz w:val="20"/>
+      </w:rPr>
+    </w:lvl>
+    <w:lvl w:ilvl="4" w:tentative="1">
+      <w:start w:val="1"/>
+      <w:numFmt w:val="bullet"/>
+      <w:lvlText w:val=""/>
+      <w:lvlJc w:val="left"/>
+      <w:pPr>
+        <w:tabs>
+          <w:tab w:val="num" w:pos="3600"/>
+        </w:tabs>
+        <w:ind w:left="3600" w:hanging="360"/>
+      </w:pPr>
+      <w:rPr>
+        <w:rFonts w:ascii="Wingdings" w:hAnsi="Wingdings" w:hint="default"/>
+        <w:sz w:val="20"/>
+      </w:rPr>
+    </w:lvl>
+    <w:lvl w:ilvl="5" w:tentative="1">
+      <w:start w:val="1"/>
+      <w:numFmt w:val="bullet"/>
+      <w:lvlText w:val=""/>
+      <w:lvlJc w:val="left"/>
+      <w:pPr>
+        <w:tabs>
+          <w:tab w:val="num" w:pos="4320"/>
+        </w:tabs>
+        <w:ind w:left="4320" w:hanging="360"/>
+      </w:pPr>
+      <w:rPr>
+        <w:rFonts w:ascii="Wingdings" w:hAnsi="Wingdings" w:hint="default"/>
+        <w:sz w:val="20"/>
+      </w:rPr>
+    </w:lvl>
+    <w:lvl w:ilvl="6" w:tentative="1">
+      <w:start w:val="1"/>
+      <w:numFmt w:val="bullet"/>
+      <w:lvlText w:val=""/>
+      <w:lvlJc w:val="left"/>
+      <w:pPr>
+        <w:tabs>
+          <w:tab w:val="num" w:pos="5040"/>
+        </w:tabs>
+        <w:ind w:left="5040" w:hanging="360"/>
+      </w:pPr>
+      <w:rPr>
+        <w:rFonts w:ascii="Wingdings" w:hAnsi="Wingdings" w:hint="default"/>
+        <w:sz w:val="20"/>
+      </w:rPr>
+    </w:lvl>
+    <w:lvl w:ilvl="7" w:tentative="1">
+      <w:start w:val="1"/>
+      <w:numFmt w:val="bullet"/>
+      <w:lvlText w:val=""/>
+      <w:lvlJc w:val="left"/>
+      <w:pPr>
+        <w:tabs>
+          <w:tab w:val="num" w:pos="5760"/>
+        </w:tabs>
+        <w:ind w:left="5760" w:hanging="360"/>
+      </w:pPr>
+      <w:rPr>
+        <w:rFonts w:ascii="Wingdings" w:hAnsi="Wingdings" w:hint="default"/>
+        <w:sz w:val="20"/>
+      </w:rPr>
+    </w:lvl>
+    <w:lvl w:ilvl="8" w:tentative="1">
+      <w:start w:val="1"/>
+      <w:numFmt w:val="bullet"/>
+      <w:lvlText w:val=""/>
+      <w:lvlJc w:val="left"/>
+      <w:pPr>
+        <w:tabs>
+          <w:tab w:val="num" w:pos="6480"/>
+        </w:tabs>
+        <w:ind w:left="6480" w:hanging="360"/>
+      </w:pPr>
+      <w:rPr>
+        <w:rFonts w:ascii="Wingdings" w:hAnsi="Wingdings" w:hint="default"/>
+        <w:sz w:val="20"/>
+      </w:rPr>
+    </w:lvl>
+  </w:abstractNum>
+  <w:abstractNum w:abstractNumId="5" w15:restartNumberingAfterBreak="0">
     <w:nsid w:val="283C2F7B"/>
     <w:multiLevelType w:val="hybridMultilevel"/>
     <w:tmpl w:val="3C26FCF8"/>
@@ -3093,7 +4443,156 @@
       </w:rPr>
     </w:lvl>
   </w:abstractNum>
-  <w:abstractNum w:abstractNumId="4" w15:restartNumberingAfterBreak="0">
+  <w:abstractNum w:abstractNumId="6" w15:restartNumberingAfterBreak="0">
+    <w:nsid w:val="3267526D"/>
+    <w:multiLevelType w:val="multilevel"/>
+    <w:tmpl w:val="B4743862"/>
+    <w:lvl w:ilvl="0">
+      <w:start w:val="1"/>
+      <w:numFmt w:val="bullet"/>
+      <w:lvlText w:val=""/>
+      <w:lvlJc w:val="left"/>
+      <w:pPr>
+        <w:tabs>
+          <w:tab w:val="num" w:pos="720"/>
+        </w:tabs>
+        <w:ind w:left="720" w:hanging="360"/>
+      </w:pPr>
+      <w:rPr>
+        <w:rFonts w:ascii="Symbol" w:hAnsi="Symbol" w:hint="default"/>
+        <w:sz w:val="20"/>
+      </w:rPr>
+    </w:lvl>
+    <w:lvl w:ilvl="1" w:tentative="1">
+      <w:start w:val="1"/>
+      <w:numFmt w:val="bullet"/>
+      <w:lvlText w:val="o"/>
+      <w:lvlJc w:val="left"/>
+      <w:pPr>
+        <w:tabs>
+          <w:tab w:val="num" w:pos="1440"/>
+        </w:tabs>
+        <w:ind w:left="1440" w:hanging="360"/>
+      </w:pPr>
+      <w:rPr>
+        <w:rFonts w:ascii="Courier New" w:hAnsi="Courier New" w:hint="default"/>
+        <w:sz w:val="20"/>
+      </w:rPr>
+    </w:lvl>
+    <w:lvl w:ilvl="2" w:tentative="1">
+      <w:start w:val="1"/>
+      <w:numFmt w:val="bullet"/>
+      <w:lvlText w:val=""/>
+      <w:lvlJc w:val="left"/>
+      <w:pPr>
+        <w:tabs>
+          <w:tab w:val="num" w:pos="2160"/>
+        </w:tabs>
+        <w:ind w:left="2160" w:hanging="360"/>
+      </w:pPr>
+      <w:rPr>
+        <w:rFonts w:ascii="Wingdings" w:hAnsi="Wingdings" w:hint="default"/>
+        <w:sz w:val="20"/>
+      </w:rPr>
+    </w:lvl>
+    <w:lvl w:ilvl="3" w:tentative="1">
+      <w:start w:val="1"/>
+      <w:numFmt w:val="bullet"/>
+      <w:lvlText w:val=""/>
+      <w:lvlJc w:val="left"/>
+      <w:pPr>
+        <w:tabs>
+          <w:tab w:val="num" w:pos="2880"/>
+        </w:tabs>
+        <w:ind w:left="2880" w:hanging="360"/>
+      </w:pPr>
+      <w:rPr>
+        <w:rFonts w:ascii="Wingdings" w:hAnsi="Wingdings" w:hint="default"/>
+        <w:sz w:val="20"/>
+      </w:rPr>
+    </w:lvl>
+    <w:lvl w:ilvl="4" w:tentative="1">
+      <w:start w:val="1"/>
+      <w:numFmt w:val="bullet"/>
+      <w:lvlText w:val=""/>
+      <w:lvlJc w:val="left"/>
+      <w:pPr>
+        <w:tabs>
+          <w:tab w:val="num" w:pos="3600"/>
+        </w:tabs>
+        <w:ind w:left="3600" w:hanging="360"/>
+      </w:pPr>
+      <w:rPr>
+        <w:rFonts w:ascii="Wingdings" w:hAnsi="Wingdings" w:hint="default"/>
+        <w:sz w:val="20"/>
+      </w:rPr>
+    </w:lvl>
+    <w:lvl w:ilvl="5" w:tentative="1">
+      <w:start w:val="1"/>
+      <w:numFmt w:val="bullet"/>
+      <w:lvlText w:val=""/>
+      <w:lvlJc w:val="left"/>
+      <w:pPr>
+        <w:tabs>
+          <w:tab w:val="num" w:pos="4320"/>
+        </w:tabs>
+        <w:ind w:left="4320" w:hanging="360"/>
+      </w:pPr>
+      <w:rPr>
+        <w:rFonts w:ascii="Wingdings" w:hAnsi="Wingdings" w:hint="default"/>
+        <w:sz w:val="20"/>
+      </w:rPr>
+    </w:lvl>
+    <w:lvl w:ilvl="6" w:tentative="1">
+      <w:start w:val="1"/>
+      <w:numFmt w:val="bullet"/>
+      <w:lvlText w:val=""/>
+      <w:lvlJc w:val="left"/>
+      <w:pPr>
+        <w:tabs>
+          <w:tab w:val="num" w:pos="5040"/>
+        </w:tabs>
+        <w:ind w:left="5040" w:hanging="360"/>
+      </w:pPr>
+      <w:rPr>
+        <w:rFonts w:ascii="Wingdings" w:hAnsi="Wingdings" w:hint="default"/>
+        <w:sz w:val="20"/>
+      </w:rPr>
+    </w:lvl>
+    <w:lvl w:ilvl="7" w:tentative="1">
+      <w:start w:val="1"/>
+      <w:numFmt w:val="bullet"/>
+      <w:lvlText w:val=""/>
+      <w:lvlJc w:val="left"/>
+      <w:pPr>
+        <w:tabs>
+          <w:tab w:val="num" w:pos="5760"/>
+        </w:tabs>
+        <w:ind w:left="5760" w:hanging="360"/>
+      </w:pPr>
+      <w:rPr>
+        <w:rFonts w:ascii="Wingdings" w:hAnsi="Wingdings" w:hint="default"/>
+        <w:sz w:val="20"/>
+      </w:rPr>
+    </w:lvl>
+    <w:lvl w:ilvl="8" w:tentative="1">
+      <w:start w:val="1"/>
+      <w:numFmt w:val="bullet"/>
+      <w:lvlText w:val=""/>
+      <w:lvlJc w:val="left"/>
+      <w:pPr>
+        <w:tabs>
+          <w:tab w:val="num" w:pos="6480"/>
+        </w:tabs>
+        <w:ind w:left="6480" w:hanging="360"/>
+      </w:pPr>
+      <w:rPr>
+        <w:rFonts w:ascii="Wingdings" w:hAnsi="Wingdings" w:hint="default"/>
+        <w:sz w:val="20"/>
+      </w:rPr>
+    </w:lvl>
+  </w:abstractNum>
+  <w:abstractNum w:abstractNumId="7" w15:restartNumberingAfterBreak="0">
     <w:nsid w:val="3B6845FC"/>
     <w:multiLevelType w:val="hybridMultilevel"/>
     <w:tmpl w:val="37842588"/>
@@ -3206,7 +4705,269 @@
       </w:rPr>
     </w:lvl>
   </w:abstractNum>
-  <w:abstractNum w:abstractNumId="5" w15:restartNumberingAfterBreak="0">
+  <w:abstractNum w:abstractNumId="8" w15:restartNumberingAfterBreak="0">
+    <w:nsid w:val="4A2D62FB"/>
+    <w:multiLevelType w:val="hybridMultilevel"/>
+    <w:tmpl w:val="0430E136"/>
+    <w:lvl w:ilvl="0" w:tplc="0C0A0001">
+      <w:start w:val="1"/>
+      <w:numFmt w:val="bullet"/>
+      <w:lvlText w:val=""/>
+      <w:lvlJc w:val="left"/>
+      <w:pPr>
+        <w:ind w:left="720" w:hanging="360"/>
+      </w:pPr>
+      <w:rPr>
+        <w:rFonts w:ascii="Symbol" w:hAnsi="Symbol" w:hint="default"/>
+      </w:rPr>
+    </w:lvl>
+    <w:lvl w:ilvl="1" w:tplc="0C0A0003" w:tentative="1">
+      <w:start w:val="1"/>
+      <w:numFmt w:val="bullet"/>
+      <w:lvlText w:val="o"/>
+      <w:lvlJc w:val="left"/>
+      <w:pPr>
+        <w:ind w:left="1440" w:hanging="360"/>
+      </w:pPr>
+      <w:rPr>
+        <w:rFonts w:ascii="Courier New" w:hAnsi="Courier New" w:cs="Courier New" w:hint="default"/>
+      </w:rPr>
+    </w:lvl>
+    <w:lvl w:ilvl="2" w:tplc="0C0A0005" w:tentative="1">
+      <w:start w:val="1"/>
+      <w:numFmt w:val="bullet"/>
+      <w:lvlText w:val=""/>
+      <w:lvlJc w:val="left"/>
+      <w:pPr>
+        <w:ind w:left="2160" w:hanging="360"/>
+      </w:pPr>
+      <w:rPr>
+        <w:rFonts w:ascii="Wingdings" w:hAnsi="Wingdings" w:hint="default"/>
+      </w:rPr>
+    </w:lvl>
+    <w:lvl w:ilvl="3" w:tplc="0C0A0001" w:tentative="1">
+      <w:start w:val="1"/>
+      <w:numFmt w:val="bullet"/>
+      <w:lvlText w:val=""/>
+      <w:lvlJc w:val="left"/>
+      <w:pPr>
+        <w:ind w:left="2880" w:hanging="360"/>
+      </w:pPr>
+      <w:rPr>
+        <w:rFonts w:ascii="Symbol" w:hAnsi="Symbol" w:hint="default"/>
+      </w:rPr>
+    </w:lvl>
+    <w:lvl w:ilvl="4" w:tplc="0C0A0003" w:tentative="1">
+      <w:start w:val="1"/>
+      <w:numFmt w:val="bullet"/>
+      <w:lvlText w:val="o"/>
+      <w:lvlJc w:val="left"/>
+      <w:pPr>
+        <w:ind w:left="3600" w:hanging="360"/>
+      </w:pPr>
+      <w:rPr>
+        <w:rFonts w:ascii="Courier New" w:hAnsi="Courier New" w:cs="Courier New" w:hint="default"/>
+      </w:rPr>
+    </w:lvl>
+    <w:lvl w:ilvl="5" w:tplc="0C0A0005" w:tentative="1">
+      <w:start w:val="1"/>
+      <w:numFmt w:val="bullet"/>
+      <w:lvlText w:val=""/>
+      <w:lvlJc w:val="left"/>
+      <w:pPr>
+        <w:ind w:left="4320" w:hanging="360"/>
+      </w:pPr>
+      <w:rPr>
+        <w:rFonts w:ascii="Wingdings" w:hAnsi="Wingdings" w:hint="default"/>
+      </w:rPr>
+    </w:lvl>
+    <w:lvl w:ilvl="6" w:tplc="0C0A0001" w:tentative="1">
+      <w:start w:val="1"/>
+      <w:numFmt w:val="bullet"/>
+      <w:lvlText w:val=""/>
+      <w:lvlJc w:val="left"/>
+      <w:pPr>
+        <w:ind w:left="5040" w:hanging="360"/>
+      </w:pPr>
+      <w:rPr>
+        <w:rFonts w:ascii="Symbol" w:hAnsi="Symbol" w:hint="default"/>
+      </w:rPr>
+    </w:lvl>
+    <w:lvl w:ilvl="7" w:tplc="0C0A0003" w:tentative="1">
+      <w:start w:val="1"/>
+      <w:numFmt w:val="bullet"/>
+      <w:lvlText w:val="o"/>
+      <w:lvlJc w:val="left"/>
+      <w:pPr>
+        <w:ind w:left="5760" w:hanging="360"/>
+      </w:pPr>
+      <w:rPr>
+        <w:rFonts w:ascii="Courier New" w:hAnsi="Courier New" w:cs="Courier New" w:hint="default"/>
+      </w:rPr>
+    </w:lvl>
+    <w:lvl w:ilvl="8" w:tplc="0C0A0005" w:tentative="1">
+      <w:start w:val="1"/>
+      <w:numFmt w:val="bullet"/>
+      <w:lvlText w:val=""/>
+      <w:lvlJc w:val="left"/>
+      <w:pPr>
+        <w:ind w:left="6480" w:hanging="360"/>
+      </w:pPr>
+      <w:rPr>
+        <w:rFonts w:ascii="Wingdings" w:hAnsi="Wingdings" w:hint="default"/>
+      </w:rPr>
+    </w:lvl>
+  </w:abstractNum>
+  <w:abstractNum w:abstractNumId="9" w15:restartNumberingAfterBreak="0">
+    <w:nsid w:val="4BD91ABB"/>
+    <w:multiLevelType w:val="multilevel"/>
+    <w:tmpl w:val="58C63998"/>
+    <w:lvl w:ilvl="0">
+      <w:start w:val="1"/>
+      <w:numFmt w:val="bullet"/>
+      <w:lvlText w:val=""/>
+      <w:lvlJc w:val="left"/>
+      <w:pPr>
+        <w:tabs>
+          <w:tab w:val="num" w:pos="720"/>
+        </w:tabs>
+        <w:ind w:left="720" w:hanging="360"/>
+      </w:pPr>
+      <w:rPr>
+        <w:rFonts w:ascii="Symbol" w:hAnsi="Symbol" w:hint="default"/>
+        <w:sz w:val="20"/>
+      </w:rPr>
+    </w:lvl>
+    <w:lvl w:ilvl="1" w:tentative="1">
+      <w:start w:val="1"/>
+      <w:numFmt w:val="bullet"/>
+      <w:lvlText w:val="o"/>
+      <w:lvlJc w:val="left"/>
+      <w:pPr>
+        <w:tabs>
+          <w:tab w:val="num" w:pos="1440"/>
+        </w:tabs>
+        <w:ind w:left="1440" w:hanging="360"/>
+      </w:pPr>
+      <w:rPr>
+        <w:rFonts w:ascii="Courier New" w:hAnsi="Courier New" w:hint="default"/>
+        <w:sz w:val="20"/>
+      </w:rPr>
+    </w:lvl>
+    <w:lvl w:ilvl="2" w:tentative="1">
+      <w:start w:val="1"/>
+      <w:numFmt w:val="bullet"/>
+      <w:lvlText w:val=""/>
+      <w:lvlJc w:val="left"/>
+      <w:pPr>
+        <w:tabs>
+          <w:tab w:val="num" w:pos="2160"/>
+        </w:tabs>
+        <w:ind w:left="2160" w:hanging="360"/>
+      </w:pPr>
+      <w:rPr>
+        <w:rFonts w:ascii="Wingdings" w:hAnsi="Wingdings" w:hint="default"/>
+        <w:sz w:val="20"/>
+      </w:rPr>
+    </w:lvl>
+    <w:lvl w:ilvl="3" w:tentative="1">
+      <w:start w:val="1"/>
+      <w:numFmt w:val="bullet"/>
+      <w:lvlText w:val=""/>
+      <w:lvlJc w:val="left"/>
+      <w:pPr>
+        <w:tabs>
+          <w:tab w:val="num" w:pos="2880"/>
+        </w:tabs>
+        <w:ind w:left="2880" w:hanging="360"/>
+      </w:pPr>
+      <w:rPr>
+        <w:rFonts w:ascii="Wingdings" w:hAnsi="Wingdings" w:hint="default"/>
+        <w:sz w:val="20"/>
+      </w:rPr>
+    </w:lvl>
+    <w:lvl w:ilvl="4" w:tentative="1">
+      <w:start w:val="1"/>
+      <w:numFmt w:val="bullet"/>
+      <w:lvlText w:val=""/>
+      <w:lvlJc w:val="left"/>
+      <w:pPr>
+        <w:tabs>
+          <w:tab w:val="num" w:pos="3600"/>
+        </w:tabs>
+        <w:ind w:left="3600" w:hanging="360"/>
+      </w:pPr>
+      <w:rPr>
+        <w:rFonts w:ascii="Wingdings" w:hAnsi="Wingdings" w:hint="default"/>
+        <w:sz w:val="20"/>
+      </w:rPr>
+    </w:lvl>
+    <w:lvl w:ilvl="5" w:tentative="1">
+      <w:start w:val="1"/>
+      <w:numFmt w:val="bullet"/>
+      <w:lvlText w:val=""/>
+      <w:lvlJc w:val="left"/>
+      <w:pPr>
+        <w:tabs>
+          <w:tab w:val="num" w:pos="4320"/>
+        </w:tabs>
+        <w:ind w:left="4320" w:hanging="360"/>
+      </w:pPr>
+      <w:rPr>
+        <w:rFonts w:ascii="Wingdings" w:hAnsi="Wingdings" w:hint="default"/>
+        <w:sz w:val="20"/>
+      </w:rPr>
+    </w:lvl>
+    <w:lvl w:ilvl="6" w:tentative="1">
+      <w:start w:val="1"/>
+      <w:numFmt w:val="bullet"/>
+      <w:lvlText w:val=""/>
+      <w:lvlJc w:val="left"/>
+      <w:pPr>
+        <w:tabs>
+          <w:tab w:val="num" w:pos="5040"/>
+        </w:tabs>
+        <w:ind w:left="5040" w:hanging="360"/>
+      </w:pPr>
+      <w:rPr>
+        <w:rFonts w:ascii="Wingdings" w:hAnsi="Wingdings" w:hint="default"/>
+        <w:sz w:val="20"/>
+      </w:rPr>
+    </w:lvl>
+    <w:lvl w:ilvl="7" w:tentative="1">
+      <w:start w:val="1"/>
+      <w:numFmt w:val="bullet"/>
+      <w:lvlText w:val=""/>
+      <w:lvlJc w:val="left"/>
+      <w:pPr>
+        <w:tabs>
+          <w:tab w:val="num" w:pos="5760"/>
+        </w:tabs>
+        <w:ind w:left="5760" w:hanging="360"/>
+      </w:pPr>
+      <w:rPr>
+        <w:rFonts w:ascii="Wingdings" w:hAnsi="Wingdings" w:hint="default"/>
+        <w:sz w:val="20"/>
+      </w:rPr>
+    </w:lvl>
+    <w:lvl w:ilvl="8" w:tentative="1">
+      <w:start w:val="1"/>
+      <w:numFmt w:val="bullet"/>
+      <w:lvlText w:val=""/>
+      <w:lvlJc w:val="left"/>
+      <w:pPr>
+        <w:tabs>
+          <w:tab w:val="num" w:pos="6480"/>
+        </w:tabs>
+        <w:ind w:left="6480" w:hanging="360"/>
+      </w:pPr>
+      <w:rPr>
+        <w:rFonts w:ascii="Wingdings" w:hAnsi="Wingdings" w:hint="default"/>
+        <w:sz w:val="20"/>
+      </w:rPr>
+    </w:lvl>
+  </w:abstractNum>
+  <w:abstractNum w:abstractNumId="10" w15:restartNumberingAfterBreak="0">
     <w:nsid w:val="4D7E1F05"/>
     <w:multiLevelType w:val="hybridMultilevel"/>
     <w:tmpl w:val="BAD2A0AA"/>
@@ -3295,7 +5056,156 @@
       </w:pPr>
     </w:lvl>
   </w:abstractNum>
-  <w:abstractNum w:abstractNumId="6" w15:restartNumberingAfterBreak="0">
+  <w:abstractNum w:abstractNumId="11" w15:restartNumberingAfterBreak="0">
+    <w:nsid w:val="555C7E8C"/>
+    <w:multiLevelType w:val="multilevel"/>
+    <w:tmpl w:val="2020EE5A"/>
+    <w:lvl w:ilvl="0">
+      <w:start w:val="1"/>
+      <w:numFmt w:val="bullet"/>
+      <w:lvlText w:val=""/>
+      <w:lvlJc w:val="left"/>
+      <w:pPr>
+        <w:tabs>
+          <w:tab w:val="num" w:pos="720"/>
+        </w:tabs>
+        <w:ind w:left="720" w:hanging="360"/>
+      </w:pPr>
+      <w:rPr>
+        <w:rFonts w:ascii="Symbol" w:hAnsi="Symbol" w:hint="default"/>
+        <w:sz w:val="20"/>
+      </w:rPr>
+    </w:lvl>
+    <w:lvl w:ilvl="1" w:tentative="1">
+      <w:start w:val="1"/>
+      <w:numFmt w:val="bullet"/>
+      <w:lvlText w:val="o"/>
+      <w:lvlJc w:val="left"/>
+      <w:pPr>
+        <w:tabs>
+          <w:tab w:val="num" w:pos="1440"/>
+        </w:tabs>
+        <w:ind w:left="1440" w:hanging="360"/>
+      </w:pPr>
+      <w:rPr>
+        <w:rFonts w:ascii="Courier New" w:hAnsi="Courier New" w:hint="default"/>
+        <w:sz w:val="20"/>
+      </w:rPr>
+    </w:lvl>
+    <w:lvl w:ilvl="2" w:tentative="1">
+      <w:start w:val="1"/>
+      <w:numFmt w:val="bullet"/>
+      <w:lvlText w:val=""/>
+      <w:lvlJc w:val="left"/>
+      <w:pPr>
+        <w:tabs>
+          <w:tab w:val="num" w:pos="2160"/>
+        </w:tabs>
+        <w:ind w:left="2160" w:hanging="360"/>
+      </w:pPr>
+      <w:rPr>
+        <w:rFonts w:ascii="Wingdings" w:hAnsi="Wingdings" w:hint="default"/>
+        <w:sz w:val="20"/>
+      </w:rPr>
+    </w:lvl>
+    <w:lvl w:ilvl="3" w:tentative="1">
+      <w:start w:val="1"/>
+      <w:numFmt w:val="bullet"/>
+      <w:lvlText w:val=""/>
+      <w:lvlJc w:val="left"/>
+      <w:pPr>
+        <w:tabs>
+          <w:tab w:val="num" w:pos="2880"/>
+        </w:tabs>
+        <w:ind w:left="2880" w:hanging="360"/>
+      </w:pPr>
+      <w:rPr>
+        <w:rFonts w:ascii="Wingdings" w:hAnsi="Wingdings" w:hint="default"/>
+        <w:sz w:val="20"/>
+      </w:rPr>
+    </w:lvl>
+    <w:lvl w:ilvl="4" w:tentative="1">
+      <w:start w:val="1"/>
+      <w:numFmt w:val="bullet"/>
+      <w:lvlText w:val=""/>
+      <w:lvlJc w:val="left"/>
+      <w:pPr>
+        <w:tabs>
+          <w:tab w:val="num" w:pos="3600"/>
+        </w:tabs>
+        <w:ind w:left="3600" w:hanging="360"/>
+      </w:pPr>
+      <w:rPr>
+        <w:rFonts w:ascii="Wingdings" w:hAnsi="Wingdings" w:hint="default"/>
+        <w:sz w:val="20"/>
+      </w:rPr>
+    </w:lvl>
+    <w:lvl w:ilvl="5" w:tentative="1">
+      <w:start w:val="1"/>
+      <w:numFmt w:val="bullet"/>
+      <w:lvlText w:val=""/>
+      <w:lvlJc w:val="left"/>
+      <w:pPr>
+        <w:tabs>
+          <w:tab w:val="num" w:pos="4320"/>
+        </w:tabs>
+        <w:ind w:left="4320" w:hanging="360"/>
+      </w:pPr>
+      <w:rPr>
+        <w:rFonts w:ascii="Wingdings" w:hAnsi="Wingdings" w:hint="default"/>
+        <w:sz w:val="20"/>
+      </w:rPr>
+    </w:lvl>
+    <w:lvl w:ilvl="6" w:tentative="1">
+      <w:start w:val="1"/>
+      <w:numFmt w:val="bullet"/>
+      <w:lvlText w:val=""/>
+      <w:lvlJc w:val="left"/>
+      <w:pPr>
+        <w:tabs>
+          <w:tab w:val="num" w:pos="5040"/>
+        </w:tabs>
+        <w:ind w:left="5040" w:hanging="360"/>
+      </w:pPr>
+      <w:rPr>
+        <w:rFonts w:ascii="Wingdings" w:hAnsi="Wingdings" w:hint="default"/>
+        <w:sz w:val="20"/>
+      </w:rPr>
+    </w:lvl>
+    <w:lvl w:ilvl="7" w:tentative="1">
+      <w:start w:val="1"/>
+      <w:numFmt w:val="bullet"/>
+      <w:lvlText w:val=""/>
+      <w:lvlJc w:val="left"/>
+      <w:pPr>
+        <w:tabs>
+          <w:tab w:val="num" w:pos="5760"/>
+        </w:tabs>
+        <w:ind w:left="5760" w:hanging="360"/>
+      </w:pPr>
+      <w:rPr>
+        <w:rFonts w:ascii="Wingdings" w:hAnsi="Wingdings" w:hint="default"/>
+        <w:sz w:val="20"/>
+      </w:rPr>
+    </w:lvl>
+    <w:lvl w:ilvl="8" w:tentative="1">
+      <w:start w:val="1"/>
+      <w:numFmt w:val="bullet"/>
+      <w:lvlText w:val=""/>
+      <w:lvlJc w:val="left"/>
+      <w:pPr>
+        <w:tabs>
+          <w:tab w:val="num" w:pos="6480"/>
+        </w:tabs>
+        <w:ind w:left="6480" w:hanging="360"/>
+      </w:pPr>
+      <w:rPr>
+        <w:rFonts w:ascii="Wingdings" w:hAnsi="Wingdings" w:hint="default"/>
+        <w:sz w:val="20"/>
+      </w:rPr>
+    </w:lvl>
+  </w:abstractNum>
+  <w:abstractNum w:abstractNumId="12" w15:restartNumberingAfterBreak="0">
     <w:nsid w:val="5C8643E5"/>
     <w:multiLevelType w:val="multilevel"/>
     <w:tmpl w:val="3E161B4C"/>
@@ -3437,7 +5347,7 @@
       </w:rPr>
     </w:lvl>
   </w:abstractNum>
-  <w:abstractNum w:abstractNumId="7" w15:restartNumberingAfterBreak="0">
+  <w:abstractNum w:abstractNumId="13" w15:restartNumberingAfterBreak="0">
     <w:nsid w:val="611955C4"/>
     <w:multiLevelType w:val="multilevel"/>
     <w:tmpl w:val="F1C6F8C8"/>
@@ -3550,7 +5460,7 @@
       </w:pPr>
     </w:lvl>
   </w:abstractNum>
-  <w:abstractNum w:abstractNumId="8" w15:restartNumberingAfterBreak="0">
+  <w:abstractNum w:abstractNumId="14" w15:restartNumberingAfterBreak="0">
     <w:nsid w:val="61402468"/>
     <w:multiLevelType w:val="multilevel"/>
     <w:tmpl w:val="AB56B116"/>
@@ -3700,7 +5610,7 @@
     </w:lvl>
   </w:abstractNum>
   <w:num w:numId="1" w16cid:durableId="1157110251">
-    <w:abstractNumId w:val="6"/>
+    <w:abstractNumId w:val="12"/>
     <w:lvlOverride w:ilvl="0"/>
     <w:lvlOverride w:ilvl="1">
       <w:startOverride w:val="1"/>
@@ -3717,28 +5627,46 @@
     <w:abstractNumId w:val="0"/>
   </w:num>
   <w:num w:numId="3" w16cid:durableId="1912277694">
-    <w:abstractNumId w:val="8"/>
+    <w:abstractNumId w:val="14"/>
   </w:num>
   <w:num w:numId="4" w16cid:durableId="2126851761">
     <w:abstractNumId w:val="1"/>
   </w:num>
   <w:num w:numId="5" w16cid:durableId="1286275317">
-    <w:abstractNumId w:val="5"/>
+    <w:abstractNumId w:val="10"/>
   </w:num>
   <w:num w:numId="6" w16cid:durableId="1832598891">
     <w:abstractNumId w:val="1"/>
   </w:num>
   <w:num w:numId="7" w16cid:durableId="424303642">
-    <w:abstractNumId w:val="3"/>
+    <w:abstractNumId w:val="5"/>
   </w:num>
   <w:num w:numId="8" w16cid:durableId="407457890">
     <w:abstractNumId w:val="2"/>
   </w:num>
   <w:num w:numId="9" w16cid:durableId="1471053413">
+    <w:abstractNumId w:val="13"/>
+  </w:num>
+  <w:num w:numId="10" w16cid:durableId="535385678">
     <w:abstractNumId w:val="7"/>
   </w:num>
-  <w:num w:numId="10" w16cid:durableId="535385678">
+  <w:num w:numId="11" w16cid:durableId="1062142385">
     <w:abstractNumId w:val="4"/>
+  </w:num>
+  <w:num w:numId="12" w16cid:durableId="484514055">
+    <w:abstractNumId w:val="3"/>
+  </w:num>
+  <w:num w:numId="13" w16cid:durableId="986133025">
+    <w:abstractNumId w:val="11"/>
+  </w:num>
+  <w:num w:numId="14" w16cid:durableId="1940215632">
+    <w:abstractNumId w:val="9"/>
+  </w:num>
+  <w:num w:numId="15" w16cid:durableId="1282610025">
+    <w:abstractNumId w:val="6"/>
+  </w:num>
+  <w:num w:numId="16" w16cid:durableId="950862716">
+    <w:abstractNumId w:val="8"/>
   </w:num>
 </w:numbering>
 </file>
@@ -4663,6 +6591,29 @@
       <w:spacing w:val="5"/>
     </w:rPr>
   </w:style>
+  <w:style w:type="character" w:styleId="Hipervnculo">
+    <w:name w:val="Hyperlink"/>
+    <w:basedOn w:val="Fuentedeprrafopredeter"/>
+    <w:uiPriority w:val="99"/>
+    <w:unhideWhenUsed/>
+    <w:rsid w:val="00A32933"/>
+    <w:rPr>
+      <w:color w:val="467886" w:themeColor="hyperlink"/>
+      <w:u w:val="single"/>
+    </w:rPr>
+  </w:style>
+  <w:style w:type="character" w:styleId="Mencinsinresolver">
+    <w:name w:val="Unresolved Mention"/>
+    <w:basedOn w:val="Fuentedeprrafopredeter"/>
+    <w:uiPriority w:val="99"/>
+    <w:semiHidden/>
+    <w:unhideWhenUsed/>
+    <w:rsid w:val="00A32933"/>
+    <w:rPr>
+      <w:color w:val="605E5C"/>
+      <w:shd w:val="clear" w:color="auto" w:fill="E1DFDD"/>
+    </w:rPr>
+  </w:style>
 </w:styles>
 </file>
 

</xml_diff>

<commit_message>
Explicabilidad con SHAP completa: cálculo de valores SHAP, Beeswarm plot para el impacto global, y Waterfall plot para el paciente de mayor riesgo predicho y el de menor
</commit_message>
<xml_diff>
--- a/documentación.docx
+++ b/documentación.docx
@@ -3451,6 +3451,13 @@
         </w:rPr>
         <w:t>para medir si el RSF predice mejor que Cox, usando el índice C y la puntuación Brier. Si su índice C es mayor, esto querrá decir que el RSF captura señal adicional que Cox no ve</w:t>
       </w:r>
+      <w:r>
+        <w:rPr>
+          <w:sz w:val="22"/>
+          <w:szCs w:val="22"/>
+        </w:rPr>
+        <w:t>.</w:t>
+      </w:r>
     </w:p>
     <w:p>
       <w:pPr>
@@ -3506,35 +3513,569 @@
     </w:p>
     <w:p>
       <w:pPr>
-        <w:pStyle w:val="Prrafodelista"/>
+        <w:pStyle w:val="Ttulo1"/>
+      </w:pPr>
+      <w:r>
+        <w:rPr>
+          <w:rFonts w:ascii="Aptos" w:hAnsi="Aptos"/>
+          <w:i/>
+          <w:iCs/>
+          <w:sz w:val="22"/>
+          <w:szCs w:val="22"/>
+        </w:rPr>
+        <w:t>COMPARATIVA DE RENDIMIENTO</w:t>
+      </w:r>
+    </w:p>
+    <w:p>
+      <w:pPr>
         <w:jc w:val="both"/>
         <w:rPr>
           <w:b/>
           <w:bCs/>
         </w:rPr>
       </w:pPr>
+      <w:r>
+        <w:rPr>
+          <w:sz w:val="22"/>
+          <w:szCs w:val="22"/>
+        </w:rPr>
+        <w:t xml:space="preserve">Tras entrenar el modelo y calcular el índice C, obtenemos que el modelo de Cox estratificado (C-index = 0.670) supera al RSF (con un C-index de 0.618) en este conjunto de datos. Este hallazgo sugiere que las relaciones entre las variables clínicas y la supervivencia son predominantemente lineales, así como que el tamaño muestral limita la ventaja que podrían tener los métodos de ML. </w:t>
+      </w:r>
+    </w:p>
+    <w:p>
+      <w:pPr>
+        <w:pStyle w:val="Ttulo1"/>
+      </w:pPr>
+      <w:r>
+        <w:rPr>
+          <w:rFonts w:ascii="Aptos" w:hAnsi="Aptos"/>
+          <w:i/>
+          <w:iCs/>
+          <w:sz w:val="22"/>
+          <w:szCs w:val="22"/>
+        </w:rPr>
+        <w:lastRenderedPageBreak/>
+        <w:t>VARIABLE IMPORTANCE</w:t>
+      </w:r>
+    </w:p>
+    <w:p>
+      <w:pPr>
+        <w:jc w:val="center"/>
+        <w:rPr>
+          <w:sz w:val="22"/>
+          <w:szCs w:val="22"/>
+        </w:rPr>
+      </w:pPr>
+      <w:r>
+        <w:rPr>
+          <w:sz w:val="22"/>
+          <w:szCs w:val="22"/>
+        </w:rPr>
+        <w:drawing>
+          <wp:inline distT="0" distB="0" distL="0" distR="0" wp14:anchorId="0C6F3388" wp14:editId="3BAAD0CF">
+            <wp:extent cx="4523014" cy="2492870"/>
+            <wp:effectExtent l="0" t="0" r="0" b="3175"/>
+            <wp:docPr id="2040645444" name="Imagen 1"/>
+            <wp:cNvGraphicFramePr>
+              <a:graphicFrameLocks xmlns:a="http://schemas.openxmlformats.org/drawingml/2006/main" noChangeAspect="1"/>
+            </wp:cNvGraphicFramePr>
+            <a:graphic xmlns:a="http://schemas.openxmlformats.org/drawingml/2006/main">
+              <a:graphicData uri="http://schemas.openxmlformats.org/drawingml/2006/picture">
+                <pic:pic xmlns:pic="http://schemas.openxmlformats.org/drawingml/2006/picture">
+                  <pic:nvPicPr>
+                    <pic:cNvPr id="2040645444" name=""/>
+                    <pic:cNvPicPr/>
+                  </pic:nvPicPr>
+                  <pic:blipFill>
+                    <a:blip r:embed="rId19"/>
+                    <a:stretch>
+                      <a:fillRect/>
+                    </a:stretch>
+                  </pic:blipFill>
+                  <pic:spPr>
+                    <a:xfrm>
+                      <a:off x="0" y="0"/>
+                      <a:ext cx="4526056" cy="2494546"/>
+                    </a:xfrm>
+                    <a:prstGeom prst="rect">
+                      <a:avLst/>
+                    </a:prstGeom>
+                  </pic:spPr>
+                </pic:pic>
+              </a:graphicData>
+            </a:graphic>
+          </wp:inline>
+        </w:drawing>
+      </w:r>
+    </w:p>
+    <w:p>
+      <w:pPr>
+        <w:jc w:val="both"/>
+        <w:rPr>
+          <w:sz w:val="22"/>
+          <w:szCs w:val="22"/>
+        </w:rPr>
+      </w:pPr>
+      <w:r>
+        <w:rPr>
+          <w:sz w:val="22"/>
+          <w:szCs w:val="22"/>
+        </w:rPr>
+        <w:t xml:space="preserve">El gráfico muestra un resultado interesante, en contraste con los del modelo de Cox. Según el RSF, “estadio” es la variable más importante, con diferencia, si bien aquí no difiere de Cox. Las siguientes variables, en cambio, sí que muestran resultados dispares a los de la sección anterior. </w:t>
+      </w:r>
+    </w:p>
+    <w:p>
+      <w:pPr>
+        <w:jc w:val="both"/>
+        <w:rPr>
+          <w:sz w:val="22"/>
+          <w:szCs w:val="22"/>
+        </w:rPr>
+      </w:pPr>
+      <w:r>
+        <w:rPr>
+          <w:sz w:val="22"/>
+          <w:szCs w:val="22"/>
+        </w:rPr>
+        <w:t>Precisamente, aquí la afección de los ganglios representa la segunda variable más importante, cuando en Cox N+ perdía significancia al ajustar por estadio. Además, aparece la edad como la tercera variable más importante. De hecho, aquí cuenta con bastante relevancia, mientras eque en Cox ni siquiera era significativa. Después, la variable “sexo” tiene poca importancia, pero no es despreciable. Por último, el nivle de metástasis es sorprendentemente la menos importante, cuando en Cox era la más significativa.</w:t>
+      </w:r>
+    </w:p>
+    <w:p>
+      <w:pPr>
+        <w:jc w:val="both"/>
+        <w:rPr>
+          <w:sz w:val="22"/>
+          <w:szCs w:val="22"/>
+        </w:rPr>
+      </w:pPr>
+      <w:r>
+        <w:rPr>
+          <w:sz w:val="22"/>
+          <w:szCs w:val="22"/>
+        </w:rPr>
+        <w:t xml:space="preserve">Uno puede preguntarse por qué tanta diferencia. Pues bien, este es exactamente el tipo de hallazgo que da valor a estas secciones del proyecto. Por un lado, Cox mide efectos lineales ajustados, y por el otro, RSF la importancia predictiva capturando no linealidades. Por ejemplo, la metástasis tiene un HR muy alto en Cox, pero solo 20 casos, lo que le aporta peso estadístico, pero poca capacidad predictiva global. </w:t>
+      </w:r>
+      <w:r>
+        <w:rPr>
+          <w:sz w:val="22"/>
+          <w:szCs w:val="22"/>
+        </w:rPr>
+        <w:t>Por ello, en RSF, como este trabaja con el conjunto completo, pondera diferente.</w:t>
+      </w:r>
+    </w:p>
+    <w:p>
+      <w:pPr>
+        <w:jc w:val="both"/>
+        <w:rPr>
+          <w:i/>
+          <w:iCs/>
+        </w:rPr>
+      </w:pPr>
+      <w:r>
+        <w:rPr>
+          <w:sz w:val="22"/>
+          <w:szCs w:val="22"/>
+        </w:rPr>
+        <w:t>Por consiguiente, el RSF identifica el estadio y la afección de los ganglios como las variables más predictivas, mientras que Cox destaca la metástasis por su alto “hazard-ratio”. Esta divergencia refleja la diferencia entre significancia estadística e importancia predictiva.</w:t>
+      </w:r>
+    </w:p>
+    <w:p/>
+    <w:p/>
+    <w:p>
+      <w:pPr>
+        <w:sectPr>
+          <w:pgSz w:w="11906" w:h="16838"/>
+          <w:pgMar w:top="1417" w:right="1701" w:bottom="1417" w:left="1701" w:header="708" w:footer="708" w:gutter="0"/>
+          <w:cols w:space="708"/>
+          <w:docGrid w:linePitch="360"/>
+        </w:sectPr>
+      </w:pPr>
+    </w:p>
+    <w:p>
+      <w:pPr>
+        <w:pStyle w:val="Ttulo1"/>
+        <w:numPr>
+          <w:ilvl w:val="0"/>
+          <w:numId w:val="5"/>
+        </w:numPr>
+        <w:jc w:val="center"/>
+      </w:pPr>
+      <w:r>
+        <w:lastRenderedPageBreak/>
+        <w:t>EXPLICABILIDAD CON SHAP</w:t>
+      </w:r>
+    </w:p>
+    <w:p>
+      <w:pPr>
+        <w:jc w:val="both"/>
+        <w:rPr>
+          <w:rFonts w:ascii="Aptos" w:hAnsi="Aptos"/>
+          <w:i/>
+          <w:iCs/>
+          <w:sz w:val="22"/>
+          <w:szCs w:val="22"/>
+        </w:rPr>
+      </w:pPr>
+      <w:r>
+        <w:rPr>
+          <w:sz w:val="22"/>
+          <w:szCs w:val="22"/>
+        </w:rPr>
+        <w:t>Responderemos a una pregunta diferente a la variable importance; en lugar de “¿qué variables importan en general?”: ¿por qué el modelo predice este riesgo concreto para este paciente concreto?</w:t>
+      </w:r>
+    </w:p>
+    <w:p>
+      <w:pPr>
+        <w:pStyle w:val="Ttulo1"/>
+      </w:pPr>
+      <w:r>
+        <w:rPr>
+          <w:rFonts w:ascii="Aptos" w:hAnsi="Aptos"/>
+          <w:i/>
+          <w:iCs/>
+          <w:sz w:val="22"/>
+          <w:szCs w:val="22"/>
+        </w:rPr>
+        <w:t>¿</w:t>
+      </w:r>
+      <w:r>
+        <w:rPr>
+          <w:rFonts w:ascii="Aptos" w:hAnsi="Aptos"/>
+          <w:i/>
+          <w:iCs/>
+          <w:sz w:val="22"/>
+          <w:szCs w:val="22"/>
+        </w:rPr>
+        <w:t xml:space="preserve">QUÉ ES </w:t>
+      </w:r>
+      <w:r>
+        <w:rPr>
+          <w:rFonts w:ascii="Aptos" w:hAnsi="Aptos"/>
+          <w:i/>
+          <w:iCs/>
+          <w:sz w:val="22"/>
+          <w:szCs w:val="22"/>
+        </w:rPr>
+        <w:t>SHAP</w:t>
+      </w:r>
+      <w:r>
+        <w:rPr>
+          <w:rFonts w:ascii="Aptos" w:hAnsi="Aptos"/>
+          <w:i/>
+          <w:iCs/>
+          <w:sz w:val="22"/>
+          <w:szCs w:val="22"/>
+        </w:rPr>
+        <w:t>?</w:t>
+      </w:r>
+    </w:p>
+    <w:p>
+      <w:pPr>
+        <w:jc w:val="both"/>
+        <w:rPr>
+          <w:sz w:val="22"/>
+          <w:szCs w:val="22"/>
+        </w:rPr>
+      </w:pPr>
+      <w:r>
+        <w:rPr>
+          <w:sz w:val="22"/>
+          <w:szCs w:val="22"/>
+        </w:rPr>
+        <w:t>SHapley Additive exPlanations es un método matemático que descompone la predicción de cualquier modelo en contribuciones individuales de cada variable. Es decir, que, para cada paciente, nos dice: “tu riesgo predicho es alto principalmente por tener estadio IV (+0.4) y ganglios afectados (+0.2), pero al ser joven, lo reduce ligeramente (-0.1)”.</w:t>
+      </w:r>
+    </w:p>
+    <w:p>
+      <w:pPr>
+        <w:jc w:val="both"/>
+        <w:rPr>
+          <w:sz w:val="22"/>
+          <w:szCs w:val="22"/>
+        </w:rPr>
+      </w:pPr>
+      <w:r>
+        <w:rPr>
+          <w:rFonts w:ascii="Aptos" w:eastAsia="Times New Roman" w:hAnsi="Aptos" w:cs="Times New Roman"/>
+          <w:i/>
+          <w:iCs/>
+          <w:color w:val="0F4761" w:themeColor="accent1" w:themeShade="BF"/>
+          <w:sz w:val="22"/>
+          <w:szCs w:val="22"/>
+        </w:rPr>
+        <w:t>APLICACIÓN AL PROYECTO</w:t>
+      </w:r>
+    </w:p>
+    <w:p>
+      <w:pPr>
+        <w:pStyle w:val="Prrafodelista"/>
+        <w:numPr>
+          <w:ilvl w:val="0"/>
+          <w:numId w:val="16"/>
+        </w:numPr>
+        <w:jc w:val="both"/>
+        <w:rPr>
+          <w:b/>
+          <w:bCs/>
+        </w:rPr>
+      </w:pPr>
+      <w:r>
+        <w:rPr>
+          <w:b/>
+          <w:bCs/>
+          <w:sz w:val="22"/>
+          <w:szCs w:val="22"/>
+        </w:rPr>
+        <w:t>Beeswarm plot</w:t>
+      </w:r>
+      <w:r>
+        <w:rPr>
+          <w:b/>
+          <w:bCs/>
+          <w:sz w:val="22"/>
+          <w:szCs w:val="22"/>
+        </w:rPr>
+        <w:t xml:space="preserve">: </w:t>
+      </w:r>
+      <w:r>
+        <w:rPr>
+          <w:sz w:val="22"/>
+          <w:szCs w:val="22"/>
+        </w:rPr>
+        <w:t xml:space="preserve">mostraremos, para todos los pacientes del test, cómo cada variable empuja el riesgo hacia arriba o hacia abajo. Así, veremos de un vistazo qué variables tienen más impacto global y en qué dirección. </w:t>
+      </w:r>
+    </w:p>
+    <w:p>
+      <w:pPr>
+        <w:pStyle w:val="Prrafodelista"/>
+        <w:numPr>
+          <w:ilvl w:val="0"/>
+          <w:numId w:val="16"/>
+        </w:numPr>
+        <w:jc w:val="both"/>
+        <w:rPr>
+          <w:b/>
+          <w:bCs/>
+        </w:rPr>
+      </w:pPr>
+      <w:r>
+        <w:rPr>
+          <w:b/>
+          <w:bCs/>
+          <w:sz w:val="22"/>
+          <w:szCs w:val="22"/>
+        </w:rPr>
+        <w:t>Waterfall plot de un paciente concreto:</w:t>
+      </w:r>
+      <w:r>
+        <w:t xml:space="preserve"> tomando un paciente específico, descomponemos su predicción, variable a variable. </w:t>
+      </w:r>
+    </w:p>
+    <w:p>
+      <w:pPr>
+        <w:pStyle w:val="Prrafodelista"/>
+        <w:numPr>
+          <w:ilvl w:val="0"/>
+          <w:numId w:val="16"/>
+        </w:numPr>
+        <w:jc w:val="both"/>
+        <w:rPr>
+          <w:b/>
+          <w:bCs/>
+        </w:rPr>
+      </w:pPr>
+      <w:r>
+        <w:rPr>
+          <w:b/>
+          <w:bCs/>
+          <w:sz w:val="22"/>
+          <w:szCs w:val="22"/>
+        </w:rPr>
+        <w:t>Comparativa de dos pacientes:</w:t>
+      </w:r>
+      <w:r>
+        <w:t xml:space="preserve"> comparamos un paciente de bajo riesgo vs uno de alto riesgo, mostrando qué variables explican la diferencia entre los dos. </w:t>
+      </w:r>
+    </w:p>
+    <w:p>
+      <w:pPr>
+        <w:jc w:val="both"/>
+        <w:rPr>
+          <w:sz w:val="22"/>
+          <w:szCs w:val="22"/>
+        </w:rPr>
+      </w:pPr>
+      <w:r>
+        <w:rPr>
+          <w:sz w:val="22"/>
+          <w:szCs w:val="22"/>
+        </w:rPr>
+        <w:t>Esta sección constituirá el factor diferencial del proyecto, transformando números en explicaciones clínicas comprensibles.</w:t>
+      </w:r>
+    </w:p>
+    <w:p>
+      <w:pPr>
+        <w:pStyle w:val="Ttulo1"/>
+      </w:pPr>
+      <w:r>
+        <w:rPr>
+          <w:rFonts w:ascii="Aptos" w:hAnsi="Aptos"/>
+          <w:i/>
+          <w:iCs/>
+          <w:sz w:val="22"/>
+          <w:szCs w:val="22"/>
+        </w:rPr>
+        <w:t>BEESWARM PLOT</w:t>
+      </w:r>
+    </w:p>
+    <w:p>
+      <w:pPr>
+        <w:jc w:val="center"/>
+        <w:rPr>
+          <w:sz w:val="22"/>
+          <w:szCs w:val="22"/>
+        </w:rPr>
+      </w:pPr>
+      <w:r>
+        <w:rPr>
+          <w:sz w:val="22"/>
+          <w:szCs w:val="22"/>
+        </w:rPr>
+        <w:drawing>
+          <wp:inline distT="0" distB="0" distL="0" distR="0" wp14:anchorId="369A4672" wp14:editId="350460AA">
+            <wp:extent cx="4392385" cy="1964797"/>
+            <wp:effectExtent l="0" t="0" r="8255" b="0"/>
+            <wp:docPr id="359707652" name="Imagen 1"/>
+            <wp:cNvGraphicFramePr>
+              <a:graphicFrameLocks xmlns:a="http://schemas.openxmlformats.org/drawingml/2006/main" noChangeAspect="1"/>
+            </wp:cNvGraphicFramePr>
+            <a:graphic xmlns:a="http://schemas.openxmlformats.org/drawingml/2006/main">
+              <a:graphicData uri="http://schemas.openxmlformats.org/drawingml/2006/picture">
+                <pic:pic xmlns:pic="http://schemas.openxmlformats.org/drawingml/2006/picture">
+                  <pic:nvPicPr>
+                    <pic:cNvPr id="359707652" name=""/>
+                    <pic:cNvPicPr/>
+                  </pic:nvPicPr>
+                  <pic:blipFill>
+                    <a:blip r:embed="rId20"/>
+                    <a:stretch>
+                      <a:fillRect/>
+                    </a:stretch>
+                  </pic:blipFill>
+                  <pic:spPr>
+                    <a:xfrm>
+                      <a:off x="0" y="0"/>
+                      <a:ext cx="4394048" cy="1965541"/>
+                    </a:xfrm>
+                    <a:prstGeom prst="rect">
+                      <a:avLst/>
+                    </a:prstGeom>
+                  </pic:spPr>
+                </pic:pic>
+              </a:graphicData>
+            </a:graphic>
+          </wp:inline>
+        </w:drawing>
+      </w:r>
+    </w:p>
+    <w:p>
+      <w:pPr>
+        <w:jc w:val="both"/>
+        <w:rPr>
+          <w:sz w:val="22"/>
+          <w:szCs w:val="22"/>
+        </w:rPr>
+      </w:pPr>
+      <w:r>
+        <w:rPr>
+          <w:sz w:val="22"/>
+          <w:szCs w:val="22"/>
+        </w:rPr>
+        <w:t>En primer lugar, para interpretar este gráfico, hemos de saber que cada punto es un paciente, y su posición horizontal indica cuánto empuja esa variable el riesgo hacia arriba (derecha) o hacia abajo (izquierda). Asimismo, el color denota el valor de la variable: rosa/rojo para valores altos, y azul para los bajos.</w:t>
+      </w:r>
+    </w:p>
+    <w:p>
+      <w:pPr>
+        <w:jc w:val="both"/>
+        <w:rPr>
+          <w:sz w:val="22"/>
+          <w:szCs w:val="22"/>
+        </w:rPr>
+      </w:pPr>
+      <w:r>
+        <w:rPr>
+          <w:sz w:val="22"/>
+          <w:szCs w:val="22"/>
+        </w:rPr>
+        <w:t xml:space="preserve">A simple vista, se puede observar que en la variable “estadio”, los puntos azules (estadios bajos, I o II) están a la izquierda y reducen el riesgo, mientras que los rosas (estadio III o IV) </w:t>
+      </w:r>
+      <w:r>
+        <w:rPr>
+          <w:sz w:val="22"/>
+          <w:szCs w:val="22"/>
+        </w:rPr>
+        <w:lastRenderedPageBreak/>
+        <w:t>están muy a la derecha, algunos hasta +20. Destaca como la variable con mayor dispersión, confirmando una vez más que es la más influyente.</w:t>
+      </w:r>
+    </w:p>
+    <w:p>
+      <w:r>
+        <w:rPr>
+          <w:b/>
+          <w:bCs/>
+        </w:rPr>
+        <w:t>Ganglios (N+)</w:t>
+      </w:r>
+      <w:r>
+        <w:t xml:space="preserve"> — los puntos rosas (ganglios positivos) empujan el riesgo hacia la derecha. Efecto claro aunque menor que el estadio.</w:t>
+      </w:r>
+    </w:p>
+    <w:p>
+      <w:r>
+        <w:rPr>
+          <w:b/>
+          <w:bCs/>
+        </w:rPr>
+        <w:t>Edad</w:t>
+      </w:r>
+      <w:r>
+        <w:t xml:space="preserve"> — efecto moderado y disperso. Los puntos rosas (edad alta) tienden ligeramente a la derecha.</w:t>
+      </w:r>
+    </w:p>
+    <w:p>
+      <w:r>
+        <w:rPr>
+          <w:b/>
+          <w:bCs/>
+        </w:rPr>
+        <w:t>Sexo y Metástasis</w:t>
+      </w:r>
+      <w:r>
+        <w:t xml:space="preserve"> — puntos muy concentrados cerca del 0, poco impacto individual. La metástasis tiene pocos casos (solo 20) por lo que apenas se ve.</w:t>
+      </w:r>
+    </w:p>
+    <w:p>
+      <w:r>
+        <w:t>Para la memoria del concurso:</w:t>
+      </w:r>
+    </w:p>
+    <w:p>
+      <w:r>
+        <w:rPr>
+          <w:i/>
+          <w:iCs/>
+        </w:rPr>
+        <w:t>"El análisis SHAP confirma el estadio TNM como el principal determinante del riesgo individual, con valores que oscilan entre -7 y +21 según el estadio del paciente."</w:t>
+      </w:r>
     </w:p>
     <w:p/>
     <w:p/>
     <w:p/>
     <w:p/>
-    <w:p/>
-    <w:p>
-      <w:r>
-        <w:t>El modelo de Cox estratificado (C-index = 0.670) supera al RSF (C-index = 0.618) en este dataset, lo que sugiere que las relaciones entre las variables clínicas y la supervivencia son predominantemente lineales y que el tamaño muestral limita la ventaja de los métodos de ML.</w:t>
-      </w:r>
-    </w:p>
-    <w:p/>
-    <w:p/>
-    <w:p/>
-    <w:p/>
-    <w:p/>
     <w:p>
       <w:pPr>
         <w:pStyle w:val="Ttulo1"/>
       </w:pPr>
       <w:r>
-        <w:lastRenderedPageBreak/>
         <w:t>INTEGRAR DATOS ESPAÑOLES</w:t>
       </w:r>
     </w:p>
@@ -3563,7 +4104,7 @@
           <w:numId w:val="15"/>
         </w:numPr>
       </w:pPr>
-      <w:hyperlink r:id="rId19" w:history="1">
+      <w:hyperlink r:id="rId21" w:history="1">
         <w:r>
           <w:rPr>
             <w:rStyle w:val="Hipervnculo"/>
@@ -3579,7 +4120,7 @@
           <w:numId w:val="15"/>
         </w:numPr>
       </w:pPr>
-      <w:hyperlink r:id="rId20" w:history="1">
+      <w:hyperlink r:id="rId22" w:history="1">
         <w:r>
           <w:rPr>
             <w:rStyle w:val="Hipervnculo"/>
@@ -5593,6 +6134,155 @@
       </w:rPr>
     </w:lvl>
     <w:lvl w:ilvl="8">
+      <w:start w:val="1"/>
+      <w:numFmt w:val="bullet"/>
+      <w:lvlText w:val=""/>
+      <w:lvlJc w:val="left"/>
+      <w:pPr>
+        <w:tabs>
+          <w:tab w:val="num" w:pos="6480"/>
+        </w:tabs>
+        <w:ind w:left="6480" w:hanging="360"/>
+      </w:pPr>
+      <w:rPr>
+        <w:rFonts w:ascii="Wingdings" w:hAnsi="Wingdings" w:hint="default"/>
+        <w:sz w:val="20"/>
+      </w:rPr>
+    </w:lvl>
+  </w:abstractNum>
+  <w:abstractNum w:abstractNumId="15" w15:restartNumberingAfterBreak="0">
+    <w:nsid w:val="6B991B1E"/>
+    <w:multiLevelType w:val="multilevel"/>
+    <w:tmpl w:val="EDDE22E0"/>
+    <w:lvl w:ilvl="0">
+      <w:start w:val="1"/>
+      <w:numFmt w:val="bullet"/>
+      <w:lvlText w:val=""/>
+      <w:lvlJc w:val="left"/>
+      <w:pPr>
+        <w:tabs>
+          <w:tab w:val="num" w:pos="720"/>
+        </w:tabs>
+        <w:ind w:left="720" w:hanging="360"/>
+      </w:pPr>
+      <w:rPr>
+        <w:rFonts w:ascii="Symbol" w:hAnsi="Symbol" w:hint="default"/>
+        <w:sz w:val="20"/>
+      </w:rPr>
+    </w:lvl>
+    <w:lvl w:ilvl="1" w:tentative="1">
+      <w:start w:val="1"/>
+      <w:numFmt w:val="bullet"/>
+      <w:lvlText w:val="o"/>
+      <w:lvlJc w:val="left"/>
+      <w:pPr>
+        <w:tabs>
+          <w:tab w:val="num" w:pos="1440"/>
+        </w:tabs>
+        <w:ind w:left="1440" w:hanging="360"/>
+      </w:pPr>
+      <w:rPr>
+        <w:rFonts w:ascii="Courier New" w:hAnsi="Courier New" w:hint="default"/>
+        <w:sz w:val="20"/>
+      </w:rPr>
+    </w:lvl>
+    <w:lvl w:ilvl="2" w:tentative="1">
+      <w:start w:val="1"/>
+      <w:numFmt w:val="bullet"/>
+      <w:lvlText w:val=""/>
+      <w:lvlJc w:val="left"/>
+      <w:pPr>
+        <w:tabs>
+          <w:tab w:val="num" w:pos="2160"/>
+        </w:tabs>
+        <w:ind w:left="2160" w:hanging="360"/>
+      </w:pPr>
+      <w:rPr>
+        <w:rFonts w:ascii="Wingdings" w:hAnsi="Wingdings" w:hint="default"/>
+        <w:sz w:val="20"/>
+      </w:rPr>
+    </w:lvl>
+    <w:lvl w:ilvl="3" w:tentative="1">
+      <w:start w:val="1"/>
+      <w:numFmt w:val="bullet"/>
+      <w:lvlText w:val=""/>
+      <w:lvlJc w:val="left"/>
+      <w:pPr>
+        <w:tabs>
+          <w:tab w:val="num" w:pos="2880"/>
+        </w:tabs>
+        <w:ind w:left="2880" w:hanging="360"/>
+      </w:pPr>
+      <w:rPr>
+        <w:rFonts w:ascii="Wingdings" w:hAnsi="Wingdings" w:hint="default"/>
+        <w:sz w:val="20"/>
+      </w:rPr>
+    </w:lvl>
+    <w:lvl w:ilvl="4" w:tentative="1">
+      <w:start w:val="1"/>
+      <w:numFmt w:val="bullet"/>
+      <w:lvlText w:val=""/>
+      <w:lvlJc w:val="left"/>
+      <w:pPr>
+        <w:tabs>
+          <w:tab w:val="num" w:pos="3600"/>
+        </w:tabs>
+        <w:ind w:left="3600" w:hanging="360"/>
+      </w:pPr>
+      <w:rPr>
+        <w:rFonts w:ascii="Wingdings" w:hAnsi="Wingdings" w:hint="default"/>
+        <w:sz w:val="20"/>
+      </w:rPr>
+    </w:lvl>
+    <w:lvl w:ilvl="5" w:tentative="1">
+      <w:start w:val="1"/>
+      <w:numFmt w:val="bullet"/>
+      <w:lvlText w:val=""/>
+      <w:lvlJc w:val="left"/>
+      <w:pPr>
+        <w:tabs>
+          <w:tab w:val="num" w:pos="4320"/>
+        </w:tabs>
+        <w:ind w:left="4320" w:hanging="360"/>
+      </w:pPr>
+      <w:rPr>
+        <w:rFonts w:ascii="Wingdings" w:hAnsi="Wingdings" w:hint="default"/>
+        <w:sz w:val="20"/>
+      </w:rPr>
+    </w:lvl>
+    <w:lvl w:ilvl="6" w:tentative="1">
+      <w:start w:val="1"/>
+      <w:numFmt w:val="bullet"/>
+      <w:lvlText w:val=""/>
+      <w:lvlJc w:val="left"/>
+      <w:pPr>
+        <w:tabs>
+          <w:tab w:val="num" w:pos="5040"/>
+        </w:tabs>
+        <w:ind w:left="5040" w:hanging="360"/>
+      </w:pPr>
+      <w:rPr>
+        <w:rFonts w:ascii="Wingdings" w:hAnsi="Wingdings" w:hint="default"/>
+        <w:sz w:val="20"/>
+      </w:rPr>
+    </w:lvl>
+    <w:lvl w:ilvl="7" w:tentative="1">
+      <w:start w:val="1"/>
+      <w:numFmt w:val="bullet"/>
+      <w:lvlText w:val=""/>
+      <w:lvlJc w:val="left"/>
+      <w:pPr>
+        <w:tabs>
+          <w:tab w:val="num" w:pos="5760"/>
+        </w:tabs>
+        <w:ind w:left="5760" w:hanging="360"/>
+      </w:pPr>
+      <w:rPr>
+        <w:rFonts w:ascii="Wingdings" w:hAnsi="Wingdings" w:hint="default"/>
+        <w:sz w:val="20"/>
+      </w:rPr>
+    </w:lvl>
+    <w:lvl w:ilvl="8" w:tentative="1">
       <w:start w:val="1"/>
       <w:numFmt w:val="bullet"/>
       <w:lvlText w:val=""/>
@@ -5667,6 +6357,9 @@
   </w:num>
   <w:num w:numId="16" w16cid:durableId="950862716">
     <w:abstractNumId w:val="8"/>
+  </w:num>
+  <w:num w:numId="17" w16cid:durableId="493180779">
+    <w:abstractNumId w:val="15"/>
   </w:num>
 </w:numbering>
 </file>

</xml_diff>